<commit_message>
Force LTR text direction in editable .docx spec
Reference docx had complex-script default w:bidi=ar-SA, which made
RTL-locale editors (e.g. Hebrew Google Docs) right-align the doc. Set
default lang bidi=en-US and explicit rtl/bidi=false so it opens LTR.
</commit_message>
<xml_diff>
--- a/docs/assets/Gambit_GTM_Spec.docx
+++ b/docs/assets/Gambit_GTM_Spec.docx
@@ -9573,11 +9573,13 @@
         <w:rFonts w:asciiTheme="minorHAnsi" w:cstheme="minorBidi" w:eastAsiaTheme="minorHAnsi" w:hAnsiTheme="minorHAnsi"/>
         <w:sz w:val="24"/>
         <w:szCs w:val="24"/>
-        <w:lang w:bidi="ar-SA" w:eastAsia="en-US" w:val="en-US"/>
+        <w:lang w:bidi="en-US" w:eastAsia="en-US" w:val="en-US"/>
+        <w:rtl w:val="false"/>
       </w:rPr>
     </w:rPrDefault>
     <w:pPrDefault>
       <w:pPr>
+        <w:bidi w:val="false"/>
         <w:spacing w:after="200"/>
       </w:pPr>
     </w:pPrDefault>

</xml_diff>

<commit_message>
Rebuild .docx in the original assignment's Google Docs format
Use the provided assignment .docx as the pandoc reference template, so the
submission inherits the exact same styling (Arial, Title/Heading2/Heading3
sizes & colors, 1.15 spacing) and title block (Title/Subtitle/Author/Date).
Natively LTR (reference uses lang=en, no ar-SA).
</commit_message>
<xml_diff>
--- a/docs/assets/Gambit_GTM_Spec.docx
+++ b/docs/assets/Gambit_GTM_Spec.docx
@@ -2,64 +2,84 @@
 <file path=word/document.xml><?xml version="1.0" encoding="utf-8"?>
 <w:document xmlns:w="http://schemas.openxmlformats.org/wordprocessingml/2006/main" xmlns:m="http://schemas.openxmlformats.org/officeDocument/2006/math" xmlns:r="http://schemas.openxmlformats.org/officeDocument/2006/relationships" xmlns:o="urn:schemas-microsoft-com:office:office" xmlns:v="urn:schemas-microsoft-com:vml" xmlns:w10="urn:schemas-microsoft-com:office:word" xmlns:a="http://schemas.openxmlformats.org/drawingml/2006/main" xmlns:pic="http://schemas.openxmlformats.org/drawingml/2006/picture" xmlns:wp="http://schemas.openxmlformats.org/drawingml/2006/wordprocessingDrawing">
   <w:body>
-    <w:sdt>
-      <w:sdtPr>
-        <w:docPartObj>
-          <w:docPartGallery w:val="Table of Contents"/>
-          <w:docPartUnique/>
-        </w:docPartObj>
-      </w:sdtPr>
-      <w:sdtContent>
-        <w:p>
-          <w:pPr>
-            <w:pStyle w:val="TOCHeading"/>
-          </w:pPr>
-          <w:r>
-            <w:t xml:space="preserve">Table of Contents</w:t>
-          </w:r>
-        </w:p>
-        <w:p>
-          <w:r>
-            <w:fldChar w:fldCharType="begin" w:dirty="true"/>
-            <w:instrText xml:space="preserve">TOC \o "1-2" \h \z \u</w:instrText>
-            <w:fldChar w:fldCharType="separate"/>
-            <w:fldChar w:fldCharType="end"/>
-          </w:r>
-        </w:p>
-      </w:sdtContent>
-    </w:sdt>
-    <w:bookmarkStart w:id="50" w:name="gambit-gtm-engineer-take-home"/>
-    <w:p>
-      <w:pPr>
-        <w:pStyle w:val="Heading1"/>
-      </w:pPr>
-      <w:r>
-        <w:t xml:space="preserve">Gambit — GTM Engineer Take-Home</w:t>
-      </w:r>
-    </w:p>
-    <w:p>
-      <w:pPr>
-        <w:pStyle w:val="FirstParagraph"/>
-      </w:pPr>
-      <w:r>
-        <w:rPr>
-          <w:bCs/>
-          <w:b/>
-        </w:rPr>
-        <w:t xml:space="preserve">Automated Post-Call Workflow</w:t>
-      </w:r>
-      <w:r>
-        <w:t xml:space="preserve"> </w:t>
-      </w:r>
-      <w:r>
-        <w:t xml:space="preserve">Author: Omri Gonen · Date: 2026-06-07</w:t>
-      </w:r>
-    </w:p>
-    <w:p>
-      <w:r>
-        <w:pict>
-          <v:rect style="width:0;height:1.5pt" o:hralign="center" o:hrstd="t" o:hr="t"/>
-        </w:pict>
+    <w:p>
+      <w:pPr>
+        <w:pStyle w:val="Title"/>
+      </w:pPr>
+      <w:r>
+        <w:t xml:space="preserve">Gambit</w:t>
+      </w:r>
+      <w:r>
+        <w:t xml:space="preserve"> </w:t>
+      </w:r>
+      <w:r>
+        <w:t xml:space="preserve">—</w:t>
+      </w:r>
+      <w:r>
+        <w:t xml:space="preserve"> </w:t>
+      </w:r>
+      <w:r>
+        <w:t xml:space="preserve">GTM</w:t>
+      </w:r>
+      <w:r>
+        <w:t xml:space="preserve"> </w:t>
+      </w:r>
+      <w:r>
+        <w:t xml:space="preserve">Engineer</w:t>
+      </w:r>
+      <w:r>
+        <w:t xml:space="preserve"> </w:t>
+      </w:r>
+      <w:r>
+        <w:t xml:space="preserve">Take-Home</w:t>
+      </w:r>
+    </w:p>
+    <w:p>
+      <w:pPr>
+        <w:pStyle w:val="Subtitle"/>
+      </w:pPr>
+      <w:r>
+        <w:t xml:space="preserve">Automated</w:t>
+      </w:r>
+      <w:r>
+        <w:t xml:space="preserve"> </w:t>
+      </w:r>
+      <w:r>
+        <w:t xml:space="preserve">Post-Call</w:t>
+      </w:r>
+      <w:r>
+        <w:t xml:space="preserve"> </w:t>
+      </w:r>
+      <w:r>
+        <w:t xml:space="preserve">Workflow</w:t>
+      </w:r>
+    </w:p>
+    <w:p>
+      <w:pPr>
+        <w:pStyle w:val="Author"/>
+      </w:pPr>
+      <w:r>
+        <w:t xml:space="preserve">Omri</w:t>
+      </w:r>
+      <w:r>
+        <w:t xml:space="preserve"> </w:t>
+      </w:r>
+      <w:r>
+        <w:t xml:space="preserve">Gonen</w:t>
+      </w:r>
+    </w:p>
+    <w:p>
+      <w:pPr>
+        <w:pStyle w:val="Date"/>
+      </w:pPr>
+      <w:r>
+        <w:t xml:space="preserve">June</w:t>
+      </w:r>
+      <w:r>
+        <w:t xml:space="preserve"> </w:t>
+      </w:r>
+      <w:r>
+        <w:t xml:space="preserve">2026</w:t>
       </w:r>
     </w:p>
     <w:bookmarkStart w:id="20" w:name="tldr-design-philosophy"/>
@@ -9123,8 +9143,12 @@
     </w:p>
     <w:bookmarkEnd w:id="48"/>
     <w:bookmarkEnd w:id="49"/>
-    <w:bookmarkEnd w:id="50"/>
-    <w:sectPr/>
+    <w:sectPr>
+      <w:headerReference r:id="rId9" w:type="default"/>
+      <w:pgSz w:h="15840" w:orient="portrait" w:w="12240"/>
+      <w:pgMar w:bottom="1440" w:footer="720" w:header="720" w:left="1440" w:right="1440" w:top="1440"/>
+      <w:pgNumType w:start="1"/>
+    </w:sectPr>
   </w:body>
 </w:document>
 </file>
@@ -9152,8 +9176,683 @@
 </w:footnotes>
 </file>
 
+<file path=word/header1.xml><?xml version="1.0" encoding="utf-8"?>
+<w:hdr xmlns:mc="http://schemas.openxmlformats.org/markup-compatibility/2006" xmlns:o="urn:schemas-microsoft-com:office:office" xmlns:r="http://schemas.openxmlformats.org/officeDocument/2006/relationships" xmlns:m="http://schemas.openxmlformats.org/officeDocument/2006/math" xmlns:v="urn:schemas-microsoft-com:vml" xmlns:wp="http://schemas.openxmlformats.org/drawingml/2006/wordprocessingDrawing" xmlns:w10="urn:schemas-microsoft-com:office:word" xmlns:w="http://schemas.openxmlformats.org/wordprocessingml/2006/main" xmlns:wne="http://schemas.microsoft.com/office/word/2006/wordml" xmlns:sl="http://schemas.openxmlformats.org/schemaLibrary/2006/main" xmlns:a="http://schemas.openxmlformats.org/drawingml/2006/main" xmlns:pic="http://schemas.openxmlformats.org/drawingml/2006/picture" xmlns:c="http://schemas.openxmlformats.org/drawingml/2006/chart" xmlns:lc="http://schemas.openxmlformats.org/drawingml/2006/lockedCanvas" xmlns:dgm="http://schemas.openxmlformats.org/drawingml/2006/diagram" xmlns:wps="http://schemas.microsoft.com/office/word/2010/wordprocessingShape" xmlns:wpg="http://schemas.microsoft.com/office/word/2010/wordprocessingGroup" xmlns:w14="http://schemas.microsoft.com/office/word/2010/wordml" xmlns:w15="http://schemas.microsoft.com/office/word/2012/wordml" xmlns:w16="http://schemas.microsoft.com/office/word/2018/wordml" xmlns:w16cex="http://schemas.microsoft.com/office/word/2018/wordml/cex" xmlns:w16cid="http://schemas.microsoft.com/office/word/2016/wordml/cid" xmlns="http://schemas.microsoft.com/office/tasks/2019/documenttasks" xmlns:cr="http://schemas.microsoft.com/office/comments/2020/reactions">
+  <w:p>
+    <w:pPr>
+      <w:rPr/>
+    </w:pPr>
+    <w:r>
+      <w:rPr>
+        <w:rtl w:val="0"/>
+      </w:rPr>
+    </w:r>
+  </w:p>
+</w:hdr>
+</file>
+
 <file path=word/numbering.xml><?xml version="1.0" encoding="utf-8"?>
-<w:numbering xmlns:w="http://schemas.openxmlformats.org/wordprocessingml/2006/main">
+<w:numbering xmlns="http://schemas.microsoft.com/office/tasks/2019/documenttasks" xmlns:a="http://schemas.openxmlformats.org/drawingml/2006/main" xmlns:c="http://schemas.openxmlformats.org/drawingml/2006/chart" xmlns:cr="http://schemas.microsoft.com/office/comments/2020/reactions" xmlns:dgm="http://schemas.openxmlformats.org/drawingml/2006/diagram" xmlns:lc="http://schemas.openxmlformats.org/drawingml/2006/lockedCanvas" xmlns:m="http://schemas.openxmlformats.org/officeDocument/2006/math" xmlns:mc="http://schemas.openxmlformats.org/markup-compatibility/2006" xmlns:o="urn:schemas-microsoft-com:office:office" xmlns:pic="http://schemas.openxmlformats.org/drawingml/2006/picture" xmlns:r="http://schemas.openxmlformats.org/officeDocument/2006/relationships" xmlns:sl="http://schemas.openxmlformats.org/schemaLibrary/2006/main" xmlns:v="urn:schemas-microsoft-com:vml" xmlns:w="http://schemas.openxmlformats.org/wordprocessingml/2006/main" xmlns:w10="urn:schemas-microsoft-com:office:word" xmlns:w14="http://schemas.microsoft.com/office/word/2010/wordml" xmlns:w15="http://schemas.microsoft.com/office/word/2012/wordml" xmlns:w16="http://schemas.microsoft.com/office/word/2018/wordml" xmlns:w16cex="http://schemas.microsoft.com/office/word/2018/wordml/cex" xmlns:w16cid="http://schemas.microsoft.com/office/word/2016/wordml/cid" xmlns:wne="http://schemas.microsoft.com/office/word/2006/wordml" xmlns:wp="http://schemas.openxmlformats.org/drawingml/2006/wordprocessingDrawing" xmlns:wpg="http://schemas.microsoft.com/office/word/2010/wordprocessingGroup" xmlns:wps="http://schemas.microsoft.com/office/word/2010/wordprocessingShape">
+  <w:abstractNum w:abstractNumId="1">
+    <w:lvl w:ilvl="0">
+      <w:start w:val="1"/>
+      <w:numFmt w:val="bullet"/>
+      <w:lvlText w:val="●"/>
+      <w:lvlJc w:val="left"/>
+      <w:pPr>
+        <w:ind w:hanging="360" w:left="720"/>
+      </w:pPr>
+      <w:rPr>
+        <w:u w:val="none"/>
+      </w:rPr>
+    </w:lvl>
+    <w:lvl w:ilvl="1">
+      <w:start w:val="1"/>
+      <w:numFmt w:val="bullet"/>
+      <w:lvlText w:val="○"/>
+      <w:lvlJc w:val="left"/>
+      <w:pPr>
+        <w:ind w:hanging="360" w:left="1440"/>
+      </w:pPr>
+      <w:rPr>
+        <w:u w:val="none"/>
+      </w:rPr>
+    </w:lvl>
+    <w:lvl w:ilvl="2">
+      <w:start w:val="1"/>
+      <w:numFmt w:val="bullet"/>
+      <w:lvlText w:val="■"/>
+      <w:lvlJc w:val="left"/>
+      <w:pPr>
+        <w:ind w:hanging="360" w:left="2160"/>
+      </w:pPr>
+      <w:rPr>
+        <w:u w:val="none"/>
+      </w:rPr>
+    </w:lvl>
+    <w:lvl w:ilvl="3">
+      <w:start w:val="1"/>
+      <w:numFmt w:val="bullet"/>
+      <w:lvlText w:val="●"/>
+      <w:lvlJc w:val="left"/>
+      <w:pPr>
+        <w:ind w:hanging="360" w:left="2880"/>
+      </w:pPr>
+      <w:rPr>
+        <w:u w:val="none"/>
+      </w:rPr>
+    </w:lvl>
+    <w:lvl w:ilvl="4">
+      <w:start w:val="1"/>
+      <w:numFmt w:val="bullet"/>
+      <w:lvlText w:val="○"/>
+      <w:lvlJc w:val="left"/>
+      <w:pPr>
+        <w:ind w:hanging="360" w:left="3600"/>
+      </w:pPr>
+      <w:rPr>
+        <w:u w:val="none"/>
+      </w:rPr>
+    </w:lvl>
+    <w:lvl w:ilvl="5">
+      <w:start w:val="1"/>
+      <w:numFmt w:val="bullet"/>
+      <w:lvlText w:val="■"/>
+      <w:lvlJc w:val="left"/>
+      <w:pPr>
+        <w:ind w:hanging="360" w:left="4320"/>
+      </w:pPr>
+      <w:rPr>
+        <w:u w:val="none"/>
+      </w:rPr>
+    </w:lvl>
+    <w:lvl w:ilvl="6">
+      <w:start w:val="1"/>
+      <w:numFmt w:val="bullet"/>
+      <w:lvlText w:val="●"/>
+      <w:lvlJc w:val="left"/>
+      <w:pPr>
+        <w:ind w:hanging="360" w:left="5040"/>
+      </w:pPr>
+      <w:rPr>
+        <w:u w:val="none"/>
+      </w:rPr>
+    </w:lvl>
+    <w:lvl w:ilvl="7">
+      <w:start w:val="1"/>
+      <w:numFmt w:val="bullet"/>
+      <w:lvlText w:val="○"/>
+      <w:lvlJc w:val="left"/>
+      <w:pPr>
+        <w:ind w:hanging="360" w:left="5760"/>
+      </w:pPr>
+      <w:rPr>
+        <w:u w:val="none"/>
+      </w:rPr>
+    </w:lvl>
+    <w:lvl w:ilvl="8">
+      <w:start w:val="1"/>
+      <w:numFmt w:val="bullet"/>
+      <w:lvlText w:val="■"/>
+      <w:lvlJc w:val="left"/>
+      <w:pPr>
+        <w:ind w:hanging="360" w:left="6480"/>
+      </w:pPr>
+      <w:rPr>
+        <w:u w:val="none"/>
+      </w:rPr>
+    </w:lvl>
+  </w:abstractNum>
+  <w:abstractNum w:abstractNumId="2">
+    <w:lvl w:ilvl="0">
+      <w:start w:val="1"/>
+      <w:numFmt w:val="decimal"/>
+      <w:lvlText w:val="%1."/>
+      <w:lvlJc w:val="left"/>
+      <w:pPr>
+        <w:ind w:hanging="360" w:left="720"/>
+      </w:pPr>
+      <w:rPr>
+        <w:u w:val="none"/>
+      </w:rPr>
+    </w:lvl>
+    <w:lvl w:ilvl="1">
+      <w:start w:val="1"/>
+      <w:numFmt w:val="bullet"/>
+      <w:lvlText w:val="○"/>
+      <w:lvlJc w:val="left"/>
+      <w:pPr>
+        <w:ind w:hanging="360" w:left="1440"/>
+      </w:pPr>
+      <w:rPr>
+        <w:u w:val="none"/>
+      </w:rPr>
+    </w:lvl>
+    <w:lvl w:ilvl="2">
+      <w:start w:val="1"/>
+      <w:numFmt w:val="lowerRoman"/>
+      <w:lvlText w:val="%3."/>
+      <w:lvlJc w:val="left"/>
+      <w:pPr>
+        <w:ind w:hanging="360" w:left="2160"/>
+      </w:pPr>
+      <w:rPr>
+        <w:u w:val="none"/>
+      </w:rPr>
+    </w:lvl>
+    <w:lvl w:ilvl="3">
+      <w:start w:val="1"/>
+      <w:numFmt w:val="decimal"/>
+      <w:lvlText w:val="%4."/>
+      <w:lvlJc w:val="left"/>
+      <w:pPr>
+        <w:ind w:hanging="360" w:left="2880"/>
+      </w:pPr>
+      <w:rPr>
+        <w:u w:val="none"/>
+      </w:rPr>
+    </w:lvl>
+    <w:lvl w:ilvl="4">
+      <w:start w:val="1"/>
+      <w:numFmt w:val="lowerLetter"/>
+      <w:lvlText w:val="%5."/>
+      <w:lvlJc w:val="left"/>
+      <w:pPr>
+        <w:ind w:hanging="360" w:left="3600"/>
+      </w:pPr>
+      <w:rPr>
+        <w:u w:val="none"/>
+      </w:rPr>
+    </w:lvl>
+    <w:lvl w:ilvl="5">
+      <w:start w:val="1"/>
+      <w:numFmt w:val="lowerRoman"/>
+      <w:lvlText w:val="%6."/>
+      <w:lvlJc w:val="left"/>
+      <w:pPr>
+        <w:ind w:hanging="360" w:left="4320"/>
+      </w:pPr>
+      <w:rPr>
+        <w:u w:val="none"/>
+      </w:rPr>
+    </w:lvl>
+    <w:lvl w:ilvl="6">
+      <w:start w:val="1"/>
+      <w:numFmt w:val="decimal"/>
+      <w:lvlText w:val="%7."/>
+      <w:lvlJc w:val="left"/>
+      <w:pPr>
+        <w:ind w:hanging="360" w:left="5040"/>
+      </w:pPr>
+      <w:rPr>
+        <w:u w:val="none"/>
+      </w:rPr>
+    </w:lvl>
+    <w:lvl w:ilvl="7">
+      <w:start w:val="1"/>
+      <w:numFmt w:val="lowerLetter"/>
+      <w:lvlText w:val="%8."/>
+      <w:lvlJc w:val="left"/>
+      <w:pPr>
+        <w:ind w:hanging="360" w:left="5760"/>
+      </w:pPr>
+      <w:rPr>
+        <w:u w:val="none"/>
+      </w:rPr>
+    </w:lvl>
+    <w:lvl w:ilvl="8">
+      <w:start w:val="1"/>
+      <w:numFmt w:val="lowerRoman"/>
+      <w:lvlText w:val="%9."/>
+      <w:lvlJc w:val="left"/>
+      <w:pPr>
+        <w:ind w:hanging="360" w:left="6480"/>
+      </w:pPr>
+      <w:rPr>
+        <w:u w:val="none"/>
+      </w:rPr>
+    </w:lvl>
+  </w:abstractNum>
+  <w:abstractNum w:abstractNumId="3">
+    <w:lvl w:ilvl="0">
+      <w:start w:val="1"/>
+      <w:numFmt w:val="decimal"/>
+      <w:lvlText w:val="%1."/>
+      <w:lvlJc w:val="left"/>
+      <w:pPr>
+        <w:ind w:hanging="360" w:left="720"/>
+      </w:pPr>
+      <w:rPr>
+        <w:u w:val="none"/>
+      </w:rPr>
+    </w:lvl>
+    <w:lvl w:ilvl="1">
+      <w:start w:val="1"/>
+      <w:numFmt w:val="lowerLetter"/>
+      <w:lvlText w:val="%2."/>
+      <w:lvlJc w:val="left"/>
+      <w:pPr>
+        <w:ind w:hanging="360" w:left="1440"/>
+      </w:pPr>
+      <w:rPr>
+        <w:u w:val="none"/>
+      </w:rPr>
+    </w:lvl>
+    <w:lvl w:ilvl="2">
+      <w:start w:val="1"/>
+      <w:numFmt w:val="lowerRoman"/>
+      <w:lvlText w:val="%3."/>
+      <w:lvlJc w:val="right"/>
+      <w:pPr>
+        <w:ind w:hanging="360" w:left="2160"/>
+      </w:pPr>
+      <w:rPr>
+        <w:u w:val="none"/>
+      </w:rPr>
+    </w:lvl>
+    <w:lvl w:ilvl="3">
+      <w:start w:val="1"/>
+      <w:numFmt w:val="decimal"/>
+      <w:lvlText w:val="%4."/>
+      <w:lvlJc w:val="left"/>
+      <w:pPr>
+        <w:ind w:hanging="360" w:left="2880"/>
+      </w:pPr>
+      <w:rPr>
+        <w:u w:val="none"/>
+      </w:rPr>
+    </w:lvl>
+    <w:lvl w:ilvl="4">
+      <w:start w:val="1"/>
+      <w:numFmt w:val="lowerLetter"/>
+      <w:lvlText w:val="%5."/>
+      <w:lvlJc w:val="left"/>
+      <w:pPr>
+        <w:ind w:hanging="360" w:left="3600"/>
+      </w:pPr>
+      <w:rPr>
+        <w:u w:val="none"/>
+      </w:rPr>
+    </w:lvl>
+    <w:lvl w:ilvl="5">
+      <w:start w:val="1"/>
+      <w:numFmt w:val="lowerRoman"/>
+      <w:lvlText w:val="%6."/>
+      <w:lvlJc w:val="right"/>
+      <w:pPr>
+        <w:ind w:hanging="360" w:left="4320"/>
+      </w:pPr>
+      <w:rPr>
+        <w:u w:val="none"/>
+      </w:rPr>
+    </w:lvl>
+    <w:lvl w:ilvl="6">
+      <w:start w:val="1"/>
+      <w:numFmt w:val="decimal"/>
+      <w:lvlText w:val="%7."/>
+      <w:lvlJc w:val="left"/>
+      <w:pPr>
+        <w:ind w:hanging="360" w:left="5040"/>
+      </w:pPr>
+      <w:rPr>
+        <w:u w:val="none"/>
+      </w:rPr>
+    </w:lvl>
+    <w:lvl w:ilvl="7">
+      <w:start w:val="1"/>
+      <w:numFmt w:val="lowerLetter"/>
+      <w:lvlText w:val="%8."/>
+      <w:lvlJc w:val="left"/>
+      <w:pPr>
+        <w:ind w:hanging="360" w:left="5760"/>
+      </w:pPr>
+      <w:rPr>
+        <w:u w:val="none"/>
+      </w:rPr>
+    </w:lvl>
+    <w:lvl w:ilvl="8">
+      <w:start w:val="1"/>
+      <w:numFmt w:val="lowerRoman"/>
+      <w:lvlText w:val="%9."/>
+      <w:lvlJc w:val="right"/>
+      <w:pPr>
+        <w:ind w:hanging="360" w:left="6480"/>
+      </w:pPr>
+      <w:rPr>
+        <w:u w:val="none"/>
+      </w:rPr>
+    </w:lvl>
+  </w:abstractNum>
+  <w:abstractNum w:abstractNumId="4">
+    <w:lvl w:ilvl="0">
+      <w:start w:val="1"/>
+      <w:numFmt w:val="bullet"/>
+      <w:lvlText w:val="●"/>
+      <w:lvlJc w:val="left"/>
+      <w:pPr>
+        <w:ind w:hanging="360" w:left="720"/>
+      </w:pPr>
+      <w:rPr>
+        <w:u w:val="none"/>
+      </w:rPr>
+    </w:lvl>
+    <w:lvl w:ilvl="1">
+      <w:start w:val="1"/>
+      <w:numFmt w:val="bullet"/>
+      <w:lvlText w:val="○"/>
+      <w:lvlJc w:val="left"/>
+      <w:pPr>
+        <w:ind w:hanging="360" w:left="1440"/>
+      </w:pPr>
+      <w:rPr>
+        <w:u w:val="none"/>
+      </w:rPr>
+    </w:lvl>
+    <w:lvl w:ilvl="2">
+      <w:start w:val="1"/>
+      <w:numFmt w:val="bullet"/>
+      <w:lvlText w:val="■"/>
+      <w:lvlJc w:val="left"/>
+      <w:pPr>
+        <w:ind w:hanging="360" w:left="2160"/>
+      </w:pPr>
+      <w:rPr>
+        <w:u w:val="none"/>
+      </w:rPr>
+    </w:lvl>
+    <w:lvl w:ilvl="3">
+      <w:start w:val="1"/>
+      <w:numFmt w:val="bullet"/>
+      <w:lvlText w:val="●"/>
+      <w:lvlJc w:val="left"/>
+      <w:pPr>
+        <w:ind w:hanging="360" w:left="2880"/>
+      </w:pPr>
+      <w:rPr>
+        <w:u w:val="none"/>
+      </w:rPr>
+    </w:lvl>
+    <w:lvl w:ilvl="4">
+      <w:start w:val="1"/>
+      <w:numFmt w:val="bullet"/>
+      <w:lvlText w:val="○"/>
+      <w:lvlJc w:val="left"/>
+      <w:pPr>
+        <w:ind w:hanging="360" w:left="3600"/>
+      </w:pPr>
+      <w:rPr>
+        <w:u w:val="none"/>
+      </w:rPr>
+    </w:lvl>
+    <w:lvl w:ilvl="5">
+      <w:start w:val="1"/>
+      <w:numFmt w:val="bullet"/>
+      <w:lvlText w:val="■"/>
+      <w:lvlJc w:val="left"/>
+      <w:pPr>
+        <w:ind w:hanging="360" w:left="4320"/>
+      </w:pPr>
+      <w:rPr>
+        <w:u w:val="none"/>
+      </w:rPr>
+    </w:lvl>
+    <w:lvl w:ilvl="6">
+      <w:start w:val="1"/>
+      <w:numFmt w:val="bullet"/>
+      <w:lvlText w:val="●"/>
+      <w:lvlJc w:val="left"/>
+      <w:pPr>
+        <w:ind w:hanging="360" w:left="5040"/>
+      </w:pPr>
+      <w:rPr>
+        <w:u w:val="none"/>
+      </w:rPr>
+    </w:lvl>
+    <w:lvl w:ilvl="7">
+      <w:start w:val="1"/>
+      <w:numFmt w:val="bullet"/>
+      <w:lvlText w:val="○"/>
+      <w:lvlJc w:val="left"/>
+      <w:pPr>
+        <w:ind w:hanging="360" w:left="5760"/>
+      </w:pPr>
+      <w:rPr>
+        <w:u w:val="none"/>
+      </w:rPr>
+    </w:lvl>
+    <w:lvl w:ilvl="8">
+      <w:start w:val="1"/>
+      <w:numFmt w:val="bullet"/>
+      <w:lvlText w:val="■"/>
+      <w:lvlJc w:val="left"/>
+      <w:pPr>
+        <w:ind w:hanging="360" w:left="6480"/>
+      </w:pPr>
+      <w:rPr>
+        <w:u w:val="none"/>
+      </w:rPr>
+    </w:lvl>
+  </w:abstractNum>
+  <w:abstractNum w:abstractNumId="5">
+    <w:lvl w:ilvl="0">
+      <w:start w:val="1"/>
+      <w:numFmt w:val="bullet"/>
+      <w:lvlText w:val="●"/>
+      <w:lvlJc w:val="left"/>
+      <w:pPr>
+        <w:ind w:hanging="360" w:left="720"/>
+      </w:pPr>
+      <w:rPr>
+        <w:u w:val="none"/>
+      </w:rPr>
+    </w:lvl>
+    <w:lvl w:ilvl="1">
+      <w:start w:val="1"/>
+      <w:numFmt w:val="bullet"/>
+      <w:lvlText w:val="○"/>
+      <w:lvlJc w:val="left"/>
+      <w:pPr>
+        <w:ind w:hanging="360" w:left="1440"/>
+      </w:pPr>
+      <w:rPr>
+        <w:u w:val="none"/>
+      </w:rPr>
+    </w:lvl>
+    <w:lvl w:ilvl="2">
+      <w:start w:val="1"/>
+      <w:numFmt w:val="bullet"/>
+      <w:lvlText w:val="■"/>
+      <w:lvlJc w:val="left"/>
+      <w:pPr>
+        <w:ind w:hanging="360" w:left="2160"/>
+      </w:pPr>
+      <w:rPr>
+        <w:u w:val="none"/>
+      </w:rPr>
+    </w:lvl>
+    <w:lvl w:ilvl="3">
+      <w:start w:val="1"/>
+      <w:numFmt w:val="bullet"/>
+      <w:lvlText w:val="●"/>
+      <w:lvlJc w:val="left"/>
+      <w:pPr>
+        <w:ind w:hanging="360" w:left="2880"/>
+      </w:pPr>
+      <w:rPr>
+        <w:u w:val="none"/>
+      </w:rPr>
+    </w:lvl>
+    <w:lvl w:ilvl="4">
+      <w:start w:val="1"/>
+      <w:numFmt w:val="bullet"/>
+      <w:lvlText w:val="○"/>
+      <w:lvlJc w:val="left"/>
+      <w:pPr>
+        <w:ind w:hanging="360" w:left="3600"/>
+      </w:pPr>
+      <w:rPr>
+        <w:u w:val="none"/>
+      </w:rPr>
+    </w:lvl>
+    <w:lvl w:ilvl="5">
+      <w:start w:val="1"/>
+      <w:numFmt w:val="bullet"/>
+      <w:lvlText w:val="■"/>
+      <w:lvlJc w:val="left"/>
+      <w:pPr>
+        <w:ind w:hanging="360" w:left="4320"/>
+      </w:pPr>
+      <w:rPr>
+        <w:u w:val="none"/>
+      </w:rPr>
+    </w:lvl>
+    <w:lvl w:ilvl="6">
+      <w:start w:val="1"/>
+      <w:numFmt w:val="bullet"/>
+      <w:lvlText w:val="●"/>
+      <w:lvlJc w:val="left"/>
+      <w:pPr>
+        <w:ind w:hanging="360" w:left="5040"/>
+      </w:pPr>
+      <w:rPr>
+        <w:u w:val="none"/>
+      </w:rPr>
+    </w:lvl>
+    <w:lvl w:ilvl="7">
+      <w:start w:val="1"/>
+      <w:numFmt w:val="bullet"/>
+      <w:lvlText w:val="○"/>
+      <w:lvlJc w:val="left"/>
+      <w:pPr>
+        <w:ind w:hanging="360" w:left="5760"/>
+      </w:pPr>
+      <w:rPr>
+        <w:u w:val="none"/>
+      </w:rPr>
+    </w:lvl>
+    <w:lvl w:ilvl="8">
+      <w:start w:val="1"/>
+      <w:numFmt w:val="bullet"/>
+      <w:lvlText w:val="■"/>
+      <w:lvlJc w:val="left"/>
+      <w:pPr>
+        <w:ind w:hanging="360" w:left="6480"/>
+      </w:pPr>
+      <w:rPr>
+        <w:u w:val="none"/>
+      </w:rPr>
+    </w:lvl>
+  </w:abstractNum>
+  <w:abstractNum w:abstractNumId="6">
+    <w:lvl w:ilvl="0">
+      <w:start w:val="1"/>
+      <w:numFmt w:val="bullet"/>
+      <w:lvlText w:val="●"/>
+      <w:lvlJc w:val="left"/>
+      <w:pPr>
+        <w:ind w:hanging="360" w:left="720"/>
+      </w:pPr>
+      <w:rPr>
+        <w:u w:val="none"/>
+      </w:rPr>
+    </w:lvl>
+    <w:lvl w:ilvl="1">
+      <w:start w:val="1"/>
+      <w:numFmt w:val="bullet"/>
+      <w:lvlText w:val="○"/>
+      <w:lvlJc w:val="left"/>
+      <w:pPr>
+        <w:ind w:hanging="360" w:left="1440"/>
+      </w:pPr>
+      <w:rPr>
+        <w:u w:val="none"/>
+      </w:rPr>
+    </w:lvl>
+    <w:lvl w:ilvl="2">
+      <w:start w:val="1"/>
+      <w:numFmt w:val="bullet"/>
+      <w:lvlText w:val="■"/>
+      <w:lvlJc w:val="left"/>
+      <w:pPr>
+        <w:ind w:hanging="360" w:left="2160"/>
+      </w:pPr>
+      <w:rPr>
+        <w:u w:val="none"/>
+      </w:rPr>
+    </w:lvl>
+    <w:lvl w:ilvl="3">
+      <w:start w:val="1"/>
+      <w:numFmt w:val="bullet"/>
+      <w:lvlText w:val="●"/>
+      <w:lvlJc w:val="left"/>
+      <w:pPr>
+        <w:ind w:hanging="360" w:left="2880"/>
+      </w:pPr>
+      <w:rPr>
+        <w:u w:val="none"/>
+      </w:rPr>
+    </w:lvl>
+    <w:lvl w:ilvl="4">
+      <w:start w:val="1"/>
+      <w:numFmt w:val="bullet"/>
+      <w:lvlText w:val="○"/>
+      <w:lvlJc w:val="left"/>
+      <w:pPr>
+        <w:ind w:hanging="360" w:left="3600"/>
+      </w:pPr>
+      <w:rPr>
+        <w:u w:val="none"/>
+      </w:rPr>
+    </w:lvl>
+    <w:lvl w:ilvl="5">
+      <w:start w:val="1"/>
+      <w:numFmt w:val="bullet"/>
+      <w:lvlText w:val="■"/>
+      <w:lvlJc w:val="left"/>
+      <w:pPr>
+        <w:ind w:hanging="360" w:left="4320"/>
+      </w:pPr>
+      <w:rPr>
+        <w:u w:val="none"/>
+      </w:rPr>
+    </w:lvl>
+    <w:lvl w:ilvl="6">
+      <w:start w:val="1"/>
+      <w:numFmt w:val="bullet"/>
+      <w:lvlText w:val="●"/>
+      <w:lvlJc w:val="left"/>
+      <w:pPr>
+        <w:ind w:hanging="360" w:left="5040"/>
+      </w:pPr>
+      <w:rPr>
+        <w:u w:val="none"/>
+      </w:rPr>
+    </w:lvl>
+    <w:lvl w:ilvl="7">
+      <w:start w:val="1"/>
+      <w:numFmt w:val="bullet"/>
+      <w:lvlText w:val="○"/>
+      <w:lvlJc w:val="left"/>
+      <w:pPr>
+        <w:ind w:hanging="360" w:left="5760"/>
+      </w:pPr>
+      <w:rPr>
+        <w:u w:val="none"/>
+      </w:rPr>
+    </w:lvl>
+    <w:lvl w:ilvl="8">
+      <w:start w:val="1"/>
+      <w:numFmt w:val="bullet"/>
+      <w:lvlText w:val="■"/>
+      <w:lvlJc w:val="left"/>
+      <w:pPr>
+        <w:ind w:hanging="360" w:left="6480"/>
+      </w:pPr>
+      <w:rPr>
+        <w:u w:val="none"/>
+      </w:rPr>
+    </w:lvl>
+  </w:abstractNum>
   <w:abstractNum w:abstractNumId="990">
     <w:nsid w:val="A990"/>
     <w:multiLevelType w:val="multilevel"/>
@@ -9391,6 +10090,24 @@
       </w:pPr>
     </w:lvl>
   </w:abstractNum>
+  <w:num w:numId="1">
+    <w:abstractNumId w:val="1"/>
+  </w:num>
+  <w:num w:numId="2">
+    <w:abstractNumId w:val="2"/>
+  </w:num>
+  <w:num w:numId="3">
+    <w:abstractNumId w:val="3"/>
+  </w:num>
+  <w:num w:numId="4">
+    <w:abstractNumId w:val="4"/>
+  </w:num>
+  <w:num w:numId="5">
+    <w:abstractNumId w:val="5"/>
+  </w:num>
+  <w:num w:numId="6">
+    <w:abstractNumId w:val="6"/>
+  </w:num>
   <w:num w:numId="1000">
     <w:abstractNumId w:val="990"/>
   </w:num>
@@ -9566,491 +10283,168 @@
 </file>
 
 <file path=word/styles.xml><?xml version="1.0" encoding="utf-8"?>
-<w:styles xmlns:r="http://schemas.openxmlformats.org/officeDocument/2006/relationships" xmlns:w="http://schemas.openxmlformats.org/wordprocessingml/2006/main">
+<w:styles xmlns="http://schemas.microsoft.com/office/tasks/2019/documenttasks" xmlns:a="http://schemas.openxmlformats.org/drawingml/2006/main" xmlns:c="http://schemas.openxmlformats.org/drawingml/2006/chart" xmlns:cr="http://schemas.microsoft.com/office/comments/2020/reactions" xmlns:dgm="http://schemas.openxmlformats.org/drawingml/2006/diagram" xmlns:lc="http://schemas.openxmlformats.org/drawingml/2006/lockedCanvas" xmlns:m="http://schemas.openxmlformats.org/officeDocument/2006/math" xmlns:mc="http://schemas.openxmlformats.org/markup-compatibility/2006" xmlns:o="urn:schemas-microsoft-com:office:office" xmlns:pic="http://schemas.openxmlformats.org/drawingml/2006/picture" xmlns:r="http://schemas.openxmlformats.org/officeDocument/2006/relationships" xmlns:sl="http://schemas.openxmlformats.org/schemaLibrary/2006/main" xmlns:v="urn:schemas-microsoft-com:vml" xmlns:w="http://schemas.openxmlformats.org/wordprocessingml/2006/main" xmlns:w10="urn:schemas-microsoft-com:office:word" xmlns:w14="http://schemas.microsoft.com/office/word/2010/wordml" xmlns:w15="http://schemas.microsoft.com/office/word/2012/wordml" xmlns:w16="http://schemas.microsoft.com/office/word/2018/wordml" xmlns:w16cex="http://schemas.microsoft.com/office/word/2018/wordml/cex" xmlns:w16cid="http://schemas.microsoft.com/office/word/2016/wordml/cid" xmlns:wne="http://schemas.microsoft.com/office/word/2006/wordml" xmlns:wp="http://schemas.openxmlformats.org/drawingml/2006/wordprocessingDrawing" xmlns:wpg="http://schemas.microsoft.com/office/word/2010/wordprocessingGroup" xmlns:wps="http://schemas.microsoft.com/office/word/2010/wordprocessingShape">
   <w:docDefaults>
     <w:rPrDefault>
       <w:rPr>
-        <w:rFonts w:asciiTheme="minorHAnsi" w:cstheme="minorBidi" w:eastAsiaTheme="minorHAnsi" w:hAnsiTheme="minorHAnsi"/>
-        <w:sz w:val="24"/>
-        <w:szCs w:val="24"/>
-        <w:lang w:bidi="en-US" w:eastAsia="en-US" w:val="en-US"/>
-        <w:rtl w:val="false"/>
+        <w:rFonts w:ascii="Arial" w:cs="Arial" w:eastAsia="Arial" w:hAnsi="Arial"/>
+        <w:sz w:val="22"/>
+        <w:szCs w:val="22"/>
+        <w:lang w:val="en"/>
       </w:rPr>
     </w:rPrDefault>
     <w:pPrDefault>
       <w:pPr>
-        <w:bidi w:val="false"/>
-        <w:spacing w:after="200"/>
+        <w:spacing w:line="276" w:lineRule="auto"/>
       </w:pPr>
     </w:pPrDefault>
   </w:docDefaults>
-  <w:latentStyles w:count="276" w:defLockedState="0" w:defQFormat="0" w:defSemiHidden="0" w:defUIPriority="0" w:defUnhideWhenUsed="0"/>
+  <w:style w:default="1" w:styleId="TableNormal" w:type="table">
+    <w:name w:val="TableNormal"/>
+    <w:tblPr>
+      <w:tblCellMar>
+        <w:top w:type="dxa" w:w="100.0"/>
+        <w:left w:type="dxa" w:w="100.0"/>
+        <w:bottom w:type="dxa" w:w="100.0"/>
+        <w:right w:type="dxa" w:w="100.0"/>
+      </w:tblCellMar>
+    </w:tblPr>
+  </w:style>
   <w:style w:default="1" w:styleId="Normal" w:type="paragraph">
-    <w:name w:val="Normal"/>
-    <w:qFormat/>
+    <w:name w:val="normal"/>
   </w:style>
-  <w:style w:styleId="BodyText" w:type="paragraph">
-    <w:name w:val="Body Text"/>
+  <w:style w:styleId="Heading1" w:type="paragraph">
+    <w:name w:val="heading 1"/>
     <w:basedOn w:val="Normal"/>
-    <w:link w:val="BodyTextChar"/>
+    <w:next w:val="Normal"/>
     <w:pPr>
-      <w:spacing w:after="180" w:before="180"/>
-    </w:pPr>
-    <w:qFormat/>
-  </w:style>
-  <w:style w:customStyle="1" w:styleId="FirstParagraph" w:type="paragraph">
-    <w:name w:val="First Paragraph"/>
-    <w:basedOn w:val="BodyText"/>
-    <w:next w:val="BodyText"/>
-    <w:qFormat/>
-  </w:style>
-  <w:style w:customStyle="1" w:styleId="Compact" w:type="paragraph">
-    <w:name w:val="Compact"/>
-    <w:basedOn w:val="BodyText"/>
-    <w:qFormat/>
-    <w:pPr>
-      <w:spacing w:after="36" w:before="36"/>
-    </w:pPr>
-  </w:style>
-  <w:style w:styleId="Title" w:type="paragraph">
-    <w:name w:val="Title"/>
-    <w:basedOn w:val="Normal"/>
-    <w:next w:val="BodyText"/>
-    <w:qFormat/>
-    <w:pPr>
-      <w:keepNext/>
-      <w:keepLines/>
-      <w:spacing w:after="240" w:before="480"/>
-      <w:jc w:val="center"/>
+      <w:keepNext w:val="1"/>
+      <w:keepLines w:val="1"/>
+      <w:pageBreakBefore w:val="0"/>
+      <w:spacing w:after="120" w:before="400" w:lineRule="auto"/>
     </w:pPr>
     <w:rPr>
-      <w:rFonts w:asciiTheme="majorHAnsi" w:cstheme="majorBidi" w:eastAsiaTheme="majorEastAsia" w:hAnsiTheme="majorHAnsi"/>
-      <w:b/>
-      <w:bCs/>
-      <w:color w:themeColor="accent1" w:themeShade="B5" w:val="345A8A"/>
-      <w:sz w:val="36"/>
-      <w:szCs w:val="36"/>
+      <w:sz w:val="40"/>
+      <w:szCs w:val="40"/>
     </w:rPr>
   </w:style>
-  <w:style w:styleId="Subtitle" w:type="paragraph">
-    <w:name w:val="Subtitle"/>
-    <w:basedOn w:val="Title"/>
-    <w:next w:val="BodyText"/>
-    <w:qFormat/>
+  <w:style w:styleId="Heading2" w:type="paragraph">
+    <w:name w:val="heading 2"/>
+    <w:basedOn w:val="Normal"/>
+    <w:next w:val="Normal"/>
     <w:pPr>
-      <w:keepNext/>
-      <w:keepLines/>
-      <w:spacing w:after="240" w:before="240"/>
-      <w:jc w:val="center"/>
+      <w:keepNext w:val="1"/>
+      <w:keepLines w:val="1"/>
+      <w:pageBreakBefore w:val="0"/>
+      <w:spacing w:after="120" w:before="360" w:lineRule="auto"/>
     </w:pPr>
     <w:rPr>
-      <w:sz w:val="30"/>
-      <w:szCs w:val="30"/>
-    </w:rPr>
-  </w:style>
-  <w:style w:customStyle="1" w:styleId="Author" w:type="paragraph">
-    <w:name w:val="Author"/>
-    <w:next w:val="BodyText"/>
-    <w:qFormat/>
-    <w:pPr>
-      <w:keepNext/>
-      <w:keepLines/>
-      <w:jc w:val="center"/>
-    </w:pPr>
-  </w:style>
-  <w:style w:styleId="Date" w:type="paragraph">
-    <w:name w:val="Date"/>
-    <w:next w:val="BodyText"/>
-    <w:qFormat/>
-    <w:pPr>
-      <w:keepNext/>
-      <w:keepLines/>
-      <w:jc w:val="center"/>
-    </w:pPr>
-  </w:style>
-  <w:style w:customStyle="1" w:styleId="AbstractTitle" w:type="paragraph">
-    <w:name w:val="Abstract Title"/>
-    <w:basedOn w:val="Normal"/>
-    <w:next w:val="Abstract"/>
-    <w:qFormat/>
-    <w:pPr>
-      <w:keepNext/>
-      <w:keepLines/>
-      <w:jc w:val="center"/>
-      <w:spacing w:after="0" w:before="300"/>
-    </w:pPr>
-    <w:rPr>
-      <w:sz w:val="20"/>
-      <w:szCs w:val="20"/>
-      <w:b/>
-      <w:color w:val="345A8A"/>
-      &gt;
-    </w:rPr>
-  </w:style>
-  <w:style w:customStyle="1" w:styleId="Abstract" w:type="paragraph">
-    <w:name w:val="Abstract"/>
-    <w:basedOn w:val="Normal"/>
-    <w:next w:val="BodyText"/>
-    <w:qFormat/>
-    <w:pPr>
-      <w:keepNext/>
-      <w:keepLines/>
-      <w:spacing w:after="300" w:before="100"/>
-    </w:pPr>
-    <w:rPr>
-      <w:sz w:val="20"/>
-      <w:szCs w:val="20"/>
-    </w:rPr>
-  </w:style>
-  <w:style w:styleId="Bibliography" w:type="paragraph">
-    <w:name w:val="Bibliography"/>
-    <w:basedOn w:val="Normal"/>
-    <w:next w:val="Bibliography"/>
-    <w:qFormat/>
-    <w:pPr/>
-    <w:rPr/>
-  </w:style>
-  <w:style w:styleId="Heading1" w:type="paragraph">
-    <w:name w:val="Heading 1"/>
-    <w:basedOn w:val="Normal"/>
-    <w:next w:val="BodyText"/>
-    <w:uiPriority w:val="9"/>
-    <w:qFormat/>
-    <w:pPr>
-      <w:keepNext/>
-      <w:keepLines/>
-      <w:spacing w:after="0" w:before="480"/>
-      <w:outlineLvl w:val="0"/>
-    </w:pPr>
-    <w:rPr>
-      <w:rFonts w:asciiTheme="majorHAnsi" w:cstheme="majorBidi" w:eastAsiaTheme="majorEastAsia" w:hAnsiTheme="majorHAnsi"/>
-      <w:b/>
-      <w:bCs/>
-      <w:color w:themeColor="accent1" w:val="4F81BD"/>
+      <w:b w:val="0"/>
+      <w:bCs w:val="0"/>
       <w:sz w:val="32"/>
       <w:szCs w:val="32"/>
     </w:rPr>
   </w:style>
-  <w:style w:styleId="Heading2" w:type="paragraph">
-    <w:name w:val="Heading 2"/>
+  <w:style w:styleId="Heading3" w:type="paragraph">
+    <w:name w:val="heading 3"/>
     <w:basedOn w:val="Normal"/>
-    <w:next w:val="BodyText"/>
-    <w:uiPriority w:val="9"/>
-    <w:unhideWhenUsed/>
-    <w:qFormat/>
+    <w:next w:val="Normal"/>
     <w:pPr>
-      <w:keepNext/>
-      <w:keepLines/>
-      <w:spacing w:after="0" w:before="200"/>
-      <w:outlineLvl w:val="1"/>
+      <w:keepNext w:val="1"/>
+      <w:keepLines w:val="1"/>
+      <w:pageBreakBefore w:val="0"/>
+      <w:spacing w:after="80" w:before="320" w:lineRule="auto"/>
     </w:pPr>
     <w:rPr>
-      <w:rFonts w:asciiTheme="majorHAnsi" w:cstheme="majorBidi" w:eastAsiaTheme="majorEastAsia" w:hAnsiTheme="majorHAnsi"/>
-      <w:b/>
-      <w:bCs/>
-      <w:color w:themeColor="accent1" w:val="4F81BD"/>
+      <w:b w:val="0"/>
+      <w:bCs w:val="0"/>
+      <w:color w:val="434343"/>
       <w:sz w:val="28"/>
       <w:szCs w:val="28"/>
     </w:rPr>
   </w:style>
-  <w:style w:styleId="Heading3" w:type="paragraph">
-    <w:name w:val="Heading 3"/>
+  <w:style w:styleId="Heading4" w:type="paragraph">
+    <w:name w:val="heading 4"/>
     <w:basedOn w:val="Normal"/>
-    <w:next w:val="BodyText"/>
-    <w:uiPriority w:val="9"/>
-    <w:unhideWhenUsed/>
-    <w:qFormat/>
+    <w:next w:val="Normal"/>
     <w:pPr>
-      <w:keepNext/>
-      <w:keepLines/>
-      <w:spacing w:after="0" w:before="200"/>
-      <w:outlineLvl w:val="2"/>
+      <w:keepNext w:val="1"/>
+      <w:keepLines w:val="1"/>
+      <w:pageBreakBefore w:val="0"/>
+      <w:spacing w:after="80" w:before="280" w:lineRule="auto"/>
     </w:pPr>
     <w:rPr>
-      <w:rFonts w:asciiTheme="majorHAnsi" w:cstheme="majorBidi" w:eastAsiaTheme="majorEastAsia" w:hAnsiTheme="majorHAnsi"/>
-      <w:b/>
-      <w:bCs/>
-      <w:color w:themeColor="accent1" w:val="4F81BD"/>
-      <w:sz w:val="24"/>
-      <w:szCs w:val="24"/>
-    </w:rPr>
-  </w:style>
-  <w:style w:styleId="Heading4" w:type="paragraph">
-    <w:name w:val="Heading 4"/>
-    <w:basedOn w:val="Normal"/>
-    <w:next w:val="BodyText"/>
-    <w:uiPriority w:val="9"/>
-    <w:unhideWhenUsed/>
-    <w:qFormat/>
-    <w:pPr>
-      <w:keepNext/>
-      <w:keepLines/>
-      <w:spacing w:after="0" w:before="200"/>
-      <w:outlineLvl w:val="3"/>
-    </w:pPr>
-    <w:rPr>
-      <w:rFonts w:asciiTheme="majorHAnsi" w:cstheme="majorBidi" w:eastAsiaTheme="majorEastAsia" w:hAnsiTheme="majorHAnsi"/>
-      <w:i/>
-      <w:bCs/>
-      <w:color w:themeColor="accent1" w:val="4F81BD"/>
+      <w:color w:val="666666"/>
       <w:sz w:val="24"/>
       <w:szCs w:val="24"/>
     </w:rPr>
   </w:style>
   <w:style w:styleId="Heading5" w:type="paragraph">
-    <w:name w:val="Heading 5"/>
+    <w:name w:val="heading 5"/>
     <w:basedOn w:val="Normal"/>
-    <w:next w:val="BodyText"/>
-    <w:uiPriority w:val="9"/>
-    <w:unhideWhenUsed/>
-    <w:qFormat/>
+    <w:next w:val="Normal"/>
     <w:pPr>
-      <w:keepNext/>
-      <w:keepLines/>
-      <w:spacing w:after="0" w:before="200"/>
-      <w:outlineLvl w:val="4"/>
+      <w:keepNext w:val="1"/>
+      <w:keepLines w:val="1"/>
+      <w:pageBreakBefore w:val="0"/>
+      <w:spacing w:after="80" w:before="240" w:lineRule="auto"/>
     </w:pPr>
     <w:rPr>
-      <w:rFonts w:asciiTheme="majorHAnsi" w:cstheme="majorBidi" w:eastAsiaTheme="majorEastAsia" w:hAnsiTheme="majorHAnsi"/>
-      <w:iCs/>
-      <w:color w:themeColor="accent1" w:val="4F81BD"/>
-      <w:sz w:val="24"/>
-      <w:szCs w:val="24"/>
+      <w:color w:val="666666"/>
+      <w:sz w:val="22"/>
+      <w:szCs w:val="22"/>
     </w:rPr>
   </w:style>
   <w:style w:styleId="Heading6" w:type="paragraph">
-    <w:name w:val="Heading 6"/>
+    <w:name w:val="heading 6"/>
     <w:basedOn w:val="Normal"/>
-    <w:next w:val="BodyText"/>
-    <w:uiPriority w:val="9"/>
-    <w:unhideWhenUsed/>
-    <w:qFormat/>
+    <w:next w:val="Normal"/>
     <w:pPr>
-      <w:keepNext/>
-      <w:keepLines/>
-      <w:spacing w:after="0" w:before="200"/>
-      <w:outlineLvl w:val="5"/>
+      <w:keepNext w:val="1"/>
+      <w:keepLines w:val="1"/>
+      <w:pageBreakBefore w:val="0"/>
+      <w:spacing w:after="80" w:before="240" w:lineRule="auto"/>
     </w:pPr>
     <w:rPr>
-      <w:rFonts w:asciiTheme="majorHAnsi" w:cstheme="majorBidi" w:eastAsiaTheme="majorEastAsia" w:hAnsiTheme="majorHAnsi"/>
-      <w:color w:themeColor="accent1" w:val="4F81BD"/>
-      <w:sz w:val="24"/>
-      <w:szCs w:val="24"/>
+      <w:i w:val="1"/>
+      <w:iCs w:val="1"/>
+      <w:color w:val="666666"/>
+      <w:sz w:val="22"/>
+      <w:szCs w:val="22"/>
     </w:rPr>
   </w:style>
-  <w:style w:styleId="Heading7" w:type="paragraph">
-    <w:name w:val="Heading 7"/>
+  <w:style w:styleId="Title" w:type="paragraph">
+    <w:name w:val="Title"/>
     <w:basedOn w:val="Normal"/>
-    <w:next w:val="BodyText"/>
-    <w:uiPriority w:val="9"/>
-    <w:unhideWhenUsed/>
-    <w:qFormat/>
+    <w:next w:val="Normal"/>
     <w:pPr>
-      <w:keepNext/>
-      <w:keepLines/>
-      <w:spacing w:after="0" w:before="200"/>
-      <w:outlineLvl w:val="6"/>
+      <w:keepNext w:val="1"/>
+      <w:keepLines w:val="1"/>
+      <w:pageBreakBefore w:val="0"/>
+      <w:spacing w:after="60" w:before="0" w:lineRule="auto"/>
     </w:pPr>
     <w:rPr>
-      <w:rFonts w:asciiTheme="majorHAnsi" w:cstheme="majorBidi" w:eastAsiaTheme="majorEastAsia" w:hAnsiTheme="majorHAnsi"/>
-      <w:color w:themeColor="accent1" w:val="4F81BD"/>
-      <w:sz w:val="24"/>
-      <w:szCs w:val="24"/>
+      <w:sz w:val="52"/>
+      <w:szCs w:val="52"/>
     </w:rPr>
   </w:style>
-  <w:style w:styleId="Heading8" w:type="paragraph">
-    <w:name w:val="Heading 8"/>
+  <w:style w:styleId="Subtitle" w:type="paragraph">
+    <w:name w:val="Subtitle"/>
     <w:basedOn w:val="Normal"/>
-    <w:next w:val="BodyText"/>
-    <w:uiPriority w:val="9"/>
-    <w:unhideWhenUsed/>
-    <w:qFormat/>
+    <w:next w:val="Normal"/>
     <w:pPr>
-      <w:keepNext/>
-      <w:keepLines/>
-      <w:spacing w:after="0" w:before="200"/>
-      <w:outlineLvl w:val="7"/>
+      <w:keepNext w:val="1"/>
+      <w:keepLines w:val="1"/>
+      <w:pageBreakBefore w:val="0"/>
+      <w:spacing w:after="320" w:before="0" w:lineRule="auto"/>
     </w:pPr>
     <w:rPr>
-      <w:rFonts w:asciiTheme="majorHAnsi" w:cstheme="majorBidi" w:eastAsiaTheme="majorEastAsia" w:hAnsiTheme="majorHAnsi"/>
-      <w:color w:themeColor="accent1" w:val="4F81BD"/>
-      <w:sz w:val="24"/>
-      <w:szCs w:val="24"/>
-    </w:rPr>
-  </w:style>
-  <w:style w:styleId="Heading9" w:type="paragraph">
-    <w:name w:val="Heading 9"/>
-    <w:basedOn w:val="Normal"/>
-    <w:next w:val="BodyText"/>
-    <w:uiPriority w:val="9"/>
-    <w:unhideWhenUsed/>
-    <w:qFormat/>
-    <w:pPr>
-      <w:keepNext/>
-      <w:keepLines/>
-      <w:spacing w:after="0" w:before="200"/>
-      <w:outlineLvl w:val="8"/>
-    </w:pPr>
-    <w:rPr>
-      <w:rFonts w:asciiTheme="majorHAnsi" w:cstheme="majorBidi" w:eastAsiaTheme="majorEastAsia" w:hAnsiTheme="majorHAnsi"/>
-      <w:color w:themeColor="accent1" w:val="4F81BD"/>
-      <w:sz w:val="24"/>
-      <w:szCs w:val="24"/>
-    </w:rPr>
-  </w:style>
-  <w:style w:styleId="BlockText" w:type="paragraph">
-    <w:name w:val="Block Text"/>
-    <w:basedOn w:val="BodyText"/>
-    <w:next w:val="BodyText"/>
-    <w:uiPriority w:val="9"/>
-    <w:unhideWhenUsed/>
-    <w:qFormat/>
-    <w:pPr>
-      <w:spacing w:after="100" w:before="100"/>
-      <w:ind w:firstLine="0" w:left="480" w:right="480"/>
-    </w:pPr>
-  </w:style>
-  <w:style w:styleId="FootnoteText" w:type="paragraph">
-    <w:name w:val="Footnote Text"/>
-    <w:basedOn w:val="Normal"/>
-    <w:next w:val="FootnoteText"/>
-    <w:uiPriority w:val="9"/>
-    <w:unhideWhenUsed/>
-    <w:qFormat/>
-  </w:style>
-  <w:style w:default="1" w:styleId="DefaultParagraphFont" w:type="character">
-    <w:name w:val="Default Paragraph Font"/>
-    <w:semiHidden/>
-    <w:unhideWhenUsed/>
-  </w:style>
-  <w:style w:default="1" w:styleId="Table" w:type="table">
-    <w:name w:val="Table"/>
-    <w:basedOn w:val="TableNormal"/>
-    <w:semiHidden/>
-    <w:unhideWhenUsed/>
-    <w:qFormat/>
-    <w:tblPr>
-      <w:tblInd w:type="dxa" w:w="0"/>
-      <w:tblCellMar>
-        <w:top w:type="dxa" w:w="0"/>
-        <w:left w:type="dxa" w:w="108"/>
-        <w:bottom w:type="dxa" w:w="0"/>
-        <w:right w:type="dxa" w:w="108"/>
-      </w:tblCellMar>
-    </w:tblPr>
-    <w:tblStylePr w:type="firstRow">
-      <w:tblPr>
-        <w:jc w:val="left"/>
-        <w:tblInd w:type="dxa" w:w="0"/>
-      </w:tblPr>
-      <w:trPr>
-        <w:jc w:val="left"/>
-      </w:trPr>
-      <w:tcPr>
-        <w:vAlign w:val="bottom"/>
-        <w:tcBorders>
-          <w:bottom w:val="single"/>
-        </w:tcBorders>
-      </w:tcPr>
-    </w:tblStylePr>
-  </w:style>
-  <w:style w:customStyle="1" w:styleId="DefinitionTerm" w:type="paragraph">
-    <w:name w:val="Definition Term"/>
-    <w:basedOn w:val="Normal"/>
-    <w:next w:val="Definition"/>
-    <w:pPr>
-      <w:keepNext/>
-      <w:keepLines/>
-      <w:spacing w:after="0"/>
-    </w:pPr>
-    <w:rPr>
-      <w:b/>
-    </w:rPr>
-  </w:style>
-  <w:style w:customStyle="1" w:styleId="Definition" w:type="paragraph">
-    <w:name w:val="Definition"/>
-    <w:basedOn w:val="Normal"/>
-  </w:style>
-  <w:style w:styleId="Caption" w:type="paragraph">
-    <w:name w:val="Caption"/>
-    <w:basedOn w:val="Normal"/>
-    <w:link w:val="BodyTextChar"/>
-    <w:pPr>
-      <w:spacing w:after="120" w:before="0"/>
-    </w:pPr>
-    <w:rPr>
-      <w:i/>
-    </w:rPr>
-  </w:style>
-  <w:style w:customStyle="1" w:styleId="TableCaption" w:type="paragraph">
-    <w:name w:val="Table Caption"/>
-    <w:basedOn w:val="Caption"/>
-    <w:pPr>
-      <w:keepNext/>
-    </w:pPr>
-  </w:style>
-  <w:style w:customStyle="1" w:styleId="ImageCaption" w:type="paragraph">
-    <w:name w:val="Image Caption"/>
-    <w:basedOn w:val="Caption"/>
-  </w:style>
-  <w:style w:customStyle="1" w:styleId="Figure" w:type="paragraph">
-    <w:name w:val="Figure"/>
-    <w:basedOn w:val="Normal"/>
-  </w:style>
-  <w:style w:customStyle="1" w:styleId="CaptionedFigure" w:type="paragraph">
-    <w:name w:val="Captioned Figure"/>
-    <w:basedOn w:val="Figure"/>
-    <w:pPr>
-      <w:keepNext/>
-    </w:pPr>
-  </w:style>
-  <w:style w:customStyle="1" w:styleId="BodyTextChar" w:type="character">
-    <w:name w:val="Body Text Char"/>
-    <w:basedOn w:val="DefaultParagraphFont"/>
-    <w:link w:val="BodyText"/>
-  </w:style>
-  <w:style w:customStyle="1" w:styleId="VerbatimChar" w:type="character">
-    <w:name w:val="Verbatim Char"/>
-    <w:basedOn w:val="BodyTextChar"/>
-    <w:rPr>
-      <w:rFonts w:ascii="Consolas" w:hAnsi="Consolas"/>
-      <w:sz w:val="22"/>
-    </w:rPr>
-  </w:style>
-  <w:style w:customStyle="1" w:styleId="SectionNumber" w:type="character">
-    <w:name w:val="Section Number"/>
-    <w:basedOn w:val="BodyTextChar"/>
-  </w:style>
-  <w:style w:styleId="FootnoteReference" w:type="character">
-    <w:name w:val="Footnote Reference"/>
-    <w:basedOn w:val="BodyTextChar"/>
-    <w:rPr>
-      <w:vertAlign w:val="superscript"/>
-    </w:rPr>
-  </w:style>
-  <w:style w:styleId="Hyperlink" w:type="character">
-    <w:name w:val="Hyperlink"/>
-    <w:basedOn w:val="BodyTextChar"/>
-    <w:rPr>
-      <w:color w:themeColor="accent1" w:val="4F81BD"/>
-    </w:rPr>
-  </w:style>
-  <w:style w:styleId="TOCHeading" w:type="paragraph">
-    <w:name w:val="TOC Heading"/>
-    <w:basedOn w:val="Heading1"/>
-    <w:next w:val="BodyText"/>
-    <w:uiPriority w:val="39"/>
-    <w:unhideWhenUsed/>
-    <w:qFormat/>
-    <w:pPr>
-      <w:spacing w:before="240" w:line="259" w:lineRule="auto"/>
-      <w:outlineLvl w:val="9"/>
-    </w:pPr>
-    <w:rPr>
-      <w:rFonts w:asciiTheme="majorHAnsi" w:cstheme="majorBidi" w:eastAsiaTheme="majorEastAsia" w:hAnsiTheme="majorHAnsi"/>
-      <w:b w:val="0"/>
-      <w:bCs w:val="0"/>
-      <w:color w:themeColor="accent1" w:themeShade="BF" w:val="365F91"/>
+      <w:rFonts w:ascii="Arial" w:cs="Arial" w:eastAsia="Arial" w:hAnsi="Arial"/>
+      <w:i w:val="0"/>
+      <w:iCs w:val="0"/>
+      <w:color w:val="666666"/>
+      <w:sz w:val="30"/>
+      <w:szCs w:val="30"/>
     </w:rPr>
   </w:style>
   <w:style w:type="paragraph" w:customStyle="1" w:styleId="SourceCode">
@@ -10365,6 +10759,7 @@
         <a:font script="Mong" typeface="Mongolian Baiti"/>
         <a:font script="Viet" typeface="Times New Roman"/>
         <a:font script="Uigh" typeface="Microsoft Uighur"/>
+        <a:font script="Geor" typeface="Sylfaen"/>
       </a:majorFont>
       <a:minorFont>
         <a:latin typeface="Cambria"/>
@@ -10399,6 +10794,7 @@
         <a:font script="Mong" typeface="Mongolian Baiti"/>
         <a:font script="Viet" typeface="Arial"/>
         <a:font script="Uigh" typeface="Microsoft Uighur"/>
+        <a:font script="Geor" typeface="Sylfaen"/>
       </a:minorFont>
     </a:fontScheme>
     <a:fmtScheme name="Office">

</xml_diff>

<commit_message>
Force LTR + left-align at paragraph level in .docx
Per-run rtl=0 wasn't enough: Google Docs (Hebrew locale) sets paragraph
direction from its own default. Add explicit <w:bidi w:val=0> + <w:jc
w:val=left> to every paragraph (plus pPrDefault), so the doc opens
left-aligned LTR regardless of editor locale.
</commit_message>
<xml_diff>
--- a/docs/assets/Gambit_GTM_Spec.docx
+++ b/docs/assets/Gambit_GTM_Spec.docx
@@ -4,6 +4,8 @@
   <w:body>
     <w:p>
       <w:pPr>
+        <w:bidi w:val="0"/>
+        <w:jc w:val="left"/>
         <w:pStyle w:val="Title"/>
       </w:pPr>
       <w:r>
@@ -63,6 +65,8 @@
     </w:p>
     <w:p>
       <w:pPr>
+        <w:bidi w:val="0"/>
+        <w:jc w:val="left"/>
         <w:pStyle w:val="Subtitle"/>
       </w:pPr>
       <w:r>
@@ -98,6 +102,8 @@
     </w:p>
     <w:p>
       <w:pPr>
+        <w:bidi w:val="0"/>
+        <w:jc w:val="left"/>
         <w:pStyle w:val="Author"/>
       </w:pPr>
       <w:r>
@@ -121,6 +127,8 @@
     </w:p>
     <w:p>
       <w:pPr>
+        <w:bidi w:val="0"/>
+        <w:jc w:val="left"/>
         <w:pStyle w:val="Date"/>
       </w:pPr>
       <w:r>
@@ -145,6 +153,8 @@
     <w:bookmarkStart w:id="20" w:name="tldr-design-philosophy"/>
     <w:p>
       <w:pPr>
+        <w:bidi w:val="0"/>
+        <w:jc w:val="left"/>
         <w:pStyle w:val="Heading2"/>
       </w:pPr>
       <w:r>
@@ -156,6 +166,8 @@
     </w:p>
     <w:p>
       <w:pPr>
+        <w:bidi w:val="0"/>
+        <w:jc w:val="left"/>
         <w:pStyle w:val="FirstParagraph"/>
       </w:pPr>
       <w:r>
@@ -241,6 +253,8 @@
     </w:p>
     <w:p>
       <w:pPr>
+        <w:bidi w:val="0"/>
+        <w:jc w:val="left"/>
         <w:numPr>
           <w:ilvl w:val="0"/>
           <w:numId w:val="1001"/>
@@ -334,6 +348,8 @@
     </w:p>
     <w:p>
       <w:pPr>
+        <w:bidi w:val="0"/>
+        <w:jc w:val="left"/>
         <w:numPr>
           <w:ilvl w:val="0"/>
           <w:numId w:val="1001"/>
@@ -413,6 +429,8 @@
     </w:p>
     <w:p>
       <w:pPr>
+        <w:bidi w:val="0"/>
+        <w:jc w:val="left"/>
         <w:numPr>
           <w:ilvl w:val="0"/>
           <w:numId w:val="1001"/>
@@ -480,6 +498,8 @@
     </w:p>
     <w:p>
       <w:pPr>
+        <w:bidi w:val="0"/>
+        <w:jc w:val="left"/>
         <w:numPr>
           <w:ilvl w:val="0"/>
           <w:numId w:val="1001"/>
@@ -535,6 +555,8 @@
     </w:p>
     <w:p>
       <w:pPr>
+        <w:bidi w:val="0"/>
+        <w:jc w:val="left"/>
         <w:numPr>
           <w:ilvl w:val="0"/>
           <w:numId w:val="1001"/>
@@ -576,6 +598,8 @@
     </w:p>
     <w:p>
       <w:pPr>
+        <w:bidi w:val="0"/>
+        <w:jc w:val="left"/>
         <w:pStyle w:val="FirstParagraph"/>
       </w:pPr>
       <w:r>
@@ -599,6 +623,8 @@
     <w:bookmarkStart w:id="21" w:name="tooling-choice-and-why"/>
     <w:p>
       <w:pPr>
+        <w:bidi w:val="0"/>
+        <w:jc w:val="left"/>
         <w:pStyle w:val="Heading2"/>
       </w:pPr>
       <w:r>
@@ -610,6 +636,8 @@
     </w:p>
     <w:p>
       <w:pPr>
+        <w:bidi w:val="0"/>
+        <w:jc w:val="left"/>
         <w:pStyle w:val="FirstParagraph"/>
       </w:pPr>
       <w:r>
@@ -635,6 +663,8 @@
     </w:p>
     <w:p>
       <w:pPr>
+        <w:bidi w:val="0"/>
+        <w:jc w:val="left"/>
         <w:numPr>
           <w:ilvl w:val="0"/>
           <w:numId w:val="1002"/>
@@ -724,6 +754,8 @@
     </w:p>
     <w:p>
       <w:pPr>
+        <w:bidi w:val="0"/>
+        <w:jc w:val="left"/>
         <w:numPr>
           <w:ilvl w:val="0"/>
           <w:numId w:val="1002"/>
@@ -801,6 +833,8 @@
     </w:p>
     <w:p>
       <w:pPr>
+        <w:bidi w:val="0"/>
+        <w:jc w:val="left"/>
         <w:numPr>
           <w:ilvl w:val="0"/>
           <w:numId w:val="1002"/>
@@ -878,6 +912,8 @@
     </w:p>
     <w:p>
       <w:pPr>
+        <w:bidi w:val="0"/>
+        <w:jc w:val="left"/>
         <w:pStyle w:val="FirstParagraph"/>
       </w:pPr>
       <w:r>
@@ -971,6 +1007,8 @@
     <w:bookmarkStart w:id="25" w:name="flow-diagram"/>
     <w:p>
       <w:pPr>
+        <w:bidi w:val="0"/>
+        <w:jc w:val="left"/>
         <w:pStyle w:val="Heading2"/>
       </w:pPr>
       <w:r>
@@ -982,6 +1020,8 @@
     </w:p>
     <w:p>
       <w:pPr>
+        <w:bidi w:val="0"/>
+        <w:jc w:val="left"/>
         <w:pStyle w:val="CaptionedFigure"/>
       </w:pPr>
       <w:r>
@@ -1032,6 +1072,8 @@
     </w:p>
     <w:p>
       <w:pPr>
+        <w:bidi w:val="0"/>
+        <w:jc w:val="left"/>
         <w:pStyle w:val="ImageCaption"/>
       </w:pPr>
       <w:r>
@@ -1055,6 +1097,8 @@
     <w:bookmarkStart w:id="35" w:name="part-1-written-spec-node-by-node"/>
     <w:p>
       <w:pPr>
+        <w:bidi w:val="0"/>
+        <w:jc w:val="left"/>
         <w:pStyle w:val="Heading2"/>
       </w:pPr>
       <w:r>
@@ -1066,6 +1110,8 @@
     </w:p>
     <w:p>
       <w:pPr>
+        <w:bidi w:val="0"/>
+        <w:jc w:val="left"/>
         <w:pStyle w:val="BlockText"/>
       </w:pPr>
       <w:r>
@@ -1215,6 +1261,8 @@
     <w:bookmarkStart w:id="26" w:name="triggers-two-front-doors-one-pipeline"/>
     <w:p>
       <w:pPr>
+        <w:bidi w:val="0"/>
+        <w:jc w:val="left"/>
         <w:pStyle w:val="Heading3"/>
       </w:pPr>
       <w:r>
@@ -1226,6 +1274,8 @@
     </w:p>
     <w:p>
       <w:pPr>
+        <w:bidi w:val="0"/>
+        <w:jc w:val="left"/>
         <w:numPr>
           <w:ilvl w:val="0"/>
           <w:numId w:val="1003"/>
@@ -1487,6 +1537,8 @@
     </w:p>
     <w:p>
       <w:pPr>
+        <w:bidi w:val="0"/>
+        <w:jc w:val="left"/>
         <w:numPr>
           <w:ilvl w:val="1"/>
           <w:numId w:val="1004"/>
@@ -1602,6 +1654,8 @@
     </w:p>
     <w:p>
       <w:pPr>
+        <w:bidi w:val="0"/>
+        <w:jc w:val="left"/>
         <w:numPr>
           <w:ilvl w:val="0"/>
           <w:numId w:val="1003"/>
@@ -1816,6 +1870,8 @@
     </w:p>
     <w:p>
       <w:pPr>
+        <w:bidi w:val="0"/>
+        <w:jc w:val="left"/>
         <w:pStyle w:val="FirstParagraph"/>
       </w:pPr>
       <w:r>
@@ -1861,6 +1917,8 @@
     <w:bookmarkStart w:id="27" w:name="normalize-dedup"/>
     <w:p>
       <w:pPr>
+        <w:bidi w:val="0"/>
+        <w:jc w:val="left"/>
         <w:pStyle w:val="Heading3"/>
       </w:pPr>
       <w:r>
@@ -1872,6 +1930,8 @@
     </w:p>
     <w:p>
       <w:pPr>
+        <w:bidi w:val="0"/>
+        <w:jc w:val="left"/>
         <w:numPr>
           <w:ilvl w:val="0"/>
           <w:numId w:val="1005"/>
@@ -2015,6 +2075,8 @@
     </w:p>
     <w:p>
       <w:pPr>
+        <w:bidi w:val="0"/>
+        <w:jc w:val="left"/>
         <w:numPr>
           <w:ilvl w:val="0"/>
           <w:numId w:val="1005"/>
@@ -2155,6 +2217,8 @@
     </w:p>
     <w:p>
       <w:pPr>
+        <w:bidi w:val="0"/>
+        <w:jc w:val="left"/>
         <w:numPr>
           <w:ilvl w:val="1"/>
           <w:numId w:val="1006"/>
@@ -2208,6 +2272,8 @@
     </w:p>
     <w:p>
       <w:pPr>
+        <w:bidi w:val="0"/>
+        <w:jc w:val="left"/>
         <w:numPr>
           <w:ilvl w:val="1"/>
           <w:numId w:val="1006"/>
@@ -2261,6 +2327,8 @@
     </w:p>
     <w:p>
       <w:pPr>
+        <w:bidi w:val="0"/>
+        <w:jc w:val="left"/>
         <w:numPr>
           <w:ilvl w:val="1"/>
           <w:numId w:val="1006"/>
@@ -2340,6 +2408,8 @@
     <w:bookmarkStart w:id="28" w:name="Xe57fa342d4db7d77809f1eca2c48a18e7249655"/>
     <w:p>
       <w:pPr>
+        <w:bidi w:val="0"/>
+        <w:jc w:val="left"/>
         <w:pStyle w:val="Heading3"/>
       </w:pPr>
       <w:r>
@@ -2351,6 +2421,8 @@
     </w:p>
     <w:p>
       <w:pPr>
+        <w:bidi w:val="0"/>
+        <w:jc w:val="left"/>
         <w:numPr>
           <w:ilvl w:val="0"/>
           <w:numId w:val="1007"/>
@@ -2461,6 +2533,8 @@
     </w:p>
     <w:p>
       <w:pPr>
+        <w:bidi w:val="0"/>
+        <w:jc w:val="left"/>
         <w:numPr>
           <w:ilvl w:val="1"/>
           <w:numId w:val="1008"/>
@@ -2490,6 +2564,8 @@
     </w:p>
     <w:p>
       <w:pPr>
+        <w:bidi w:val="0"/>
+        <w:jc w:val="left"/>
         <w:numPr>
           <w:ilvl w:val="1"/>
           <w:numId w:val="1008"/>
@@ -2531,6 +2607,8 @@
     </w:p>
     <w:p>
       <w:pPr>
+        <w:bidi w:val="0"/>
+        <w:jc w:val="left"/>
         <w:numPr>
           <w:ilvl w:val="0"/>
           <w:numId w:val="1007"/>
@@ -2739,6 +2817,8 @@
     </w:p>
     <w:p>
       <w:pPr>
+        <w:bidi w:val="0"/>
+        <w:jc w:val="left"/>
         <w:numPr>
           <w:ilvl w:val="1"/>
           <w:numId w:val="1009"/>
@@ -3016,6 +3096,8 @@
     </w:p>
     <w:p>
       <w:pPr>
+        <w:bidi w:val="0"/>
+        <w:jc w:val="left"/>
         <w:numPr>
           <w:ilvl w:val="1"/>
           <w:numId w:val="1009"/>
@@ -3079,6 +3161,8 @@
     <w:bookmarkStart w:id="29" w:name="transcript-retrieval"/>
     <w:p>
       <w:pPr>
+        <w:bidi w:val="0"/>
+        <w:jc w:val="left"/>
         <w:pStyle w:val="Heading3"/>
       </w:pPr>
       <w:r>
@@ -3090,6 +3174,8 @@
     </w:p>
     <w:p>
       <w:pPr>
+        <w:bidi w:val="0"/>
+        <w:jc w:val="left"/>
         <w:numPr>
           <w:ilvl w:val="0"/>
           <w:numId w:val="1010"/>
@@ -3107,6 +3193,8 @@
     </w:p>
     <w:p>
       <w:pPr>
+        <w:bidi w:val="0"/>
+        <w:jc w:val="left"/>
         <w:numPr>
           <w:ilvl w:val="1"/>
           <w:numId w:val="1011"/>
@@ -3186,6 +3274,8 @@
     </w:p>
     <w:p>
       <w:pPr>
+        <w:bidi w:val="0"/>
+        <w:jc w:val="left"/>
         <w:numPr>
           <w:ilvl w:val="1"/>
           <w:numId w:val="1011"/>
@@ -3228,6 +3318,8 @@
     </w:p>
     <w:p>
       <w:pPr>
+        <w:bidi w:val="0"/>
+        <w:jc w:val="left"/>
         <w:numPr>
           <w:ilvl w:val="0"/>
           <w:numId w:val="1010"/>
@@ -3386,6 +3478,8 @@
     <w:bookmarkStart w:id="30" w:name="ai-extraction-claude"/>
     <w:p>
       <w:pPr>
+        <w:bidi w:val="0"/>
+        <w:jc w:val="left"/>
         <w:pStyle w:val="Heading3"/>
       </w:pPr>
       <w:r>
@@ -3397,6 +3491,8 @@
     </w:p>
     <w:p>
       <w:pPr>
+        <w:bidi w:val="0"/>
+        <w:jc w:val="left"/>
         <w:numPr>
           <w:ilvl w:val="0"/>
           <w:numId w:val="1012"/>
@@ -3513,6 +3609,8 @@
     </w:p>
     <w:p>
       <w:pPr>
+        <w:bidi w:val="0"/>
+        <w:jc w:val="left"/>
         <w:numPr>
           <w:ilvl w:val="0"/>
           <w:numId w:val="1000"/>
@@ -4603,6 +4701,8 @@
     </w:p>
     <w:p>
       <w:pPr>
+        <w:bidi w:val="0"/>
+        <w:jc w:val="left"/>
         <w:numPr>
           <w:ilvl w:val="0"/>
           <w:numId w:val="1012"/>
@@ -4682,6 +4782,8 @@
     </w:p>
     <w:p>
       <w:pPr>
+        <w:bidi w:val="0"/>
+        <w:jc w:val="left"/>
         <w:numPr>
           <w:ilvl w:val="1"/>
           <w:numId w:val="1013"/>
@@ -4771,6 +4873,8 @@
     </w:p>
     <w:p>
       <w:pPr>
+        <w:bidi w:val="0"/>
+        <w:jc w:val="left"/>
         <w:numPr>
           <w:ilvl w:val="1"/>
           <w:numId w:val="1013"/>
@@ -4824,6 +4928,8 @@
     </w:p>
     <w:p>
       <w:pPr>
+        <w:bidi w:val="0"/>
+        <w:jc w:val="left"/>
         <w:pStyle w:val="BlockText"/>
       </w:pPr>
       <w:r>
@@ -4944,6 +5050,8 @@
     <w:bookmarkStart w:id="31" w:name="X981c12bbd110cdfc40178b23ef8e72be2067eef"/>
     <w:p>
       <w:pPr>
+        <w:bidi w:val="0"/>
+        <w:jc w:val="left"/>
         <w:pStyle w:val="Heading3"/>
       </w:pPr>
       <w:r>
@@ -4955,6 +5063,8 @@
     </w:p>
     <w:p>
       <w:pPr>
+        <w:bidi w:val="0"/>
+        <w:jc w:val="left"/>
         <w:numPr>
           <w:ilvl w:val="0"/>
           <w:numId w:val="1014"/>
@@ -4984,6 +5094,8 @@
     </w:p>
     <w:p>
       <w:pPr>
+        <w:bidi w:val="0"/>
+        <w:jc w:val="left"/>
         <w:numPr>
           <w:ilvl w:val="0"/>
           <w:numId w:val="1014"/>
@@ -5001,6 +5113,8 @@
     </w:p>
     <w:p>
       <w:pPr>
+        <w:bidi w:val="0"/>
+        <w:jc w:val="left"/>
         <w:numPr>
           <w:ilvl w:val="1"/>
           <w:numId w:val="1015"/>
@@ -5097,6 +5211,8 @@
     </w:p>
     <w:p>
       <w:pPr>
+        <w:bidi w:val="0"/>
+        <w:jc w:val="left"/>
         <w:numPr>
           <w:ilvl w:val="1"/>
           <w:numId w:val="1015"/>
@@ -5172,6 +5288,8 @@
     </w:p>
     <w:p>
       <w:pPr>
+        <w:bidi w:val="0"/>
+        <w:jc w:val="left"/>
         <w:numPr>
           <w:ilvl w:val="2"/>
           <w:numId w:val="1016"/>
@@ -5293,6 +5411,8 @@
     </w:p>
     <w:p>
       <w:pPr>
+        <w:bidi w:val="0"/>
+        <w:jc w:val="left"/>
         <w:numPr>
           <w:ilvl w:val="2"/>
           <w:numId w:val="1016"/>
@@ -5378,6 +5498,8 @@
     </w:p>
     <w:p>
       <w:pPr>
+        <w:bidi w:val="0"/>
+        <w:jc w:val="left"/>
         <w:numPr>
           <w:ilvl w:val="1"/>
           <w:numId w:val="1015"/>
@@ -5471,6 +5593,8 @@
     </w:p>
     <w:p>
       <w:pPr>
+        <w:bidi w:val="0"/>
+        <w:jc w:val="left"/>
         <w:numPr>
           <w:ilvl w:val="0"/>
           <w:numId w:val="1014"/>
@@ -5488,6 +5612,8 @@
     </w:p>
     <w:p>
       <w:pPr>
+        <w:bidi w:val="0"/>
+        <w:jc w:val="left"/>
         <w:numPr>
           <w:ilvl w:val="1"/>
           <w:numId w:val="1017"/>
@@ -5503,6 +5629,8 @@
     </w:p>
     <w:p>
       <w:pPr>
+        <w:bidi w:val="0"/>
+        <w:jc w:val="left"/>
         <w:numPr>
           <w:ilvl w:val="1"/>
           <w:numId w:val="1017"/>
@@ -5518,6 +5646,8 @@
     </w:p>
     <w:p>
       <w:pPr>
+        <w:bidi w:val="0"/>
+        <w:jc w:val="left"/>
         <w:numPr>
           <w:ilvl w:val="1"/>
           <w:numId w:val="1017"/>
@@ -5533,6 +5663,8 @@
     </w:p>
     <w:p>
       <w:pPr>
+        <w:bidi w:val="0"/>
+        <w:jc w:val="left"/>
         <w:numPr>
           <w:ilvl w:val="0"/>
           <w:numId w:val="1014"/>
@@ -5574,6 +5706,8 @@
     </w:p>
     <w:p>
       <w:pPr>
+        <w:bidi w:val="0"/>
+        <w:jc w:val="left"/>
         <w:pStyle w:val="FirstParagraph"/>
       </w:pPr>
       <w:r>
@@ -5613,6 +5747,8 @@
     <w:bookmarkStart w:id="32" w:name="Xc7c52f4ad7151389076dc8126d51d593771e6fd"/>
     <w:p>
       <w:pPr>
+        <w:bidi w:val="0"/>
+        <w:jc w:val="left"/>
         <w:pStyle w:val="Heading3"/>
       </w:pPr>
       <w:r>
@@ -5624,6 +5760,8 @@
     </w:p>
     <w:p>
       <w:pPr>
+        <w:bidi w:val="0"/>
+        <w:jc w:val="left"/>
         <w:numPr>
           <w:ilvl w:val="0"/>
           <w:numId w:val="1018"/>
@@ -5732,6 +5870,8 @@
     </w:p>
     <w:p>
       <w:pPr>
+        <w:bidi w:val="0"/>
+        <w:jc w:val="left"/>
         <w:numPr>
           <w:ilvl w:val="0"/>
           <w:numId w:val="1018"/>
@@ -5773,6 +5913,8 @@
     </w:p>
     <w:p>
       <w:pPr>
+        <w:bidi w:val="0"/>
+        <w:jc w:val="left"/>
         <w:numPr>
           <w:ilvl w:val="0"/>
           <w:numId w:val="1018"/>
@@ -5922,6 +6064,8 @@
     <w:bookmarkStart w:id="33" w:name="output-routing"/>
     <w:p>
       <w:pPr>
+        <w:bidi w:val="0"/>
+        <w:jc w:val="left"/>
         <w:pStyle w:val="Heading3"/>
       </w:pPr>
       <w:r>
@@ -5933,6 +6077,8 @@
     </w:p>
     <w:p>
       <w:pPr>
+        <w:bidi w:val="0"/>
+        <w:jc w:val="left"/>
         <w:numPr>
           <w:ilvl w:val="0"/>
           <w:numId w:val="1019"/>
@@ -5962,6 +6108,8 @@
     </w:p>
     <w:p>
       <w:pPr>
+        <w:bidi w:val="0"/>
+        <w:jc w:val="left"/>
         <w:numPr>
           <w:ilvl w:val="0"/>
           <w:numId w:val="1019"/>
@@ -5991,6 +6139,8 @@
     </w:p>
     <w:p>
       <w:pPr>
+        <w:bidi w:val="0"/>
+        <w:jc w:val="left"/>
         <w:numPr>
           <w:ilvl w:val="0"/>
           <w:numId w:val="1019"/>
@@ -6020,6 +6170,8 @@
     </w:p>
     <w:p>
       <w:pPr>
+        <w:bidi w:val="0"/>
+        <w:jc w:val="left"/>
         <w:numPr>
           <w:ilvl w:val="0"/>
           <w:numId w:val="1019"/>
@@ -6075,6 +6227,8 @@
     </w:p>
     <w:p>
       <w:pPr>
+        <w:bidi w:val="0"/>
+        <w:jc w:val="left"/>
         <w:numPr>
           <w:ilvl w:val="0"/>
           <w:numId w:val="1019"/>
@@ -6137,6 +6291,8 @@
     <w:bookmarkStart w:id="34" w:name="X59c5d723437650499f729f1df20bd6cfae2fb04"/>
     <w:p>
       <w:pPr>
+        <w:bidi w:val="0"/>
+        <w:jc w:val="left"/>
         <w:pStyle w:val="Heading3"/>
       </w:pPr>
       <w:r>
@@ -6184,6 +6340,8 @@
     </w:p>
     <w:p>
       <w:pPr>
+        <w:bidi w:val="0"/>
+        <w:jc w:val="left"/>
         <w:numPr>
           <w:ilvl w:val="0"/>
           <w:numId w:val="1020"/>
@@ -6282,6 +6440,8 @@
     </w:p>
     <w:p>
       <w:pPr>
+        <w:bidi w:val="0"/>
+        <w:jc w:val="left"/>
         <w:numPr>
           <w:ilvl w:val="0"/>
           <w:numId w:val="1020"/>
@@ -6330,6 +6490,8 @@
     </w:p>
     <w:p>
       <w:pPr>
+        <w:bidi w:val="0"/>
+        <w:jc w:val="left"/>
         <w:numPr>
           <w:ilvl w:val="0"/>
           <w:numId w:val="1020"/>
@@ -6496,6 +6658,8 @@
     </w:p>
     <w:p>
       <w:pPr>
+        <w:bidi w:val="0"/>
+        <w:jc w:val="left"/>
         <w:numPr>
           <w:ilvl w:val="0"/>
           <w:numId w:val="1020"/>
@@ -6550,6 +6714,8 @@
     <w:bookmarkStart w:id="36" w:name="X4dd822200868a2cf15c01ebba5d8924a57f1903"/>
     <w:p>
       <w:pPr>
+        <w:bidi w:val="0"/>
+        <w:jc w:val="left"/>
         <w:pStyle w:val="Heading2"/>
       </w:pPr>
       <w:r>
@@ -6582,6 +6748,8 @@
           <w:tcPr/>
           <w:p>
             <w:pPr>
+              <w:bidi w:val="0"/>
+              <w:jc w:val="left"/>
               <w:pStyle w:val="Compact"/>
               <w:jc w:val="left"/>
             </w:pPr>
@@ -6597,6 +6765,8 @@
           <w:tcPr/>
           <w:p>
             <w:pPr>
+              <w:bidi w:val="0"/>
+              <w:jc w:val="left"/>
               <w:pStyle w:val="Compact"/>
               <w:jc w:val="left"/>
             </w:pPr>
@@ -6612,6 +6782,8 @@
           <w:tcPr/>
           <w:p>
             <w:pPr>
+              <w:bidi w:val="0"/>
+              <w:jc w:val="left"/>
               <w:pStyle w:val="Compact"/>
               <w:jc w:val="left"/>
             </w:pPr>
@@ -6627,6 +6799,8 @@
           <w:tcPr/>
           <w:p>
             <w:pPr>
+              <w:bidi w:val="0"/>
+              <w:jc w:val="left"/>
               <w:pStyle w:val="Compact"/>
               <w:jc w:val="left"/>
             </w:pPr>
@@ -6642,6 +6816,8 @@
           <w:tcPr/>
           <w:p>
             <w:pPr>
+              <w:bidi w:val="0"/>
+              <w:jc w:val="left"/>
               <w:pStyle w:val="Compact"/>
               <w:jc w:val="left"/>
             </w:pPr>
@@ -6657,6 +6833,8 @@
           <w:tcPr/>
           <w:p>
             <w:pPr>
+              <w:bidi w:val="0"/>
+              <w:jc w:val="left"/>
               <w:pStyle w:val="Compact"/>
               <w:jc w:val="left"/>
             </w:pPr>
@@ -6674,6 +6852,8 @@
           <w:tcPr/>
           <w:p>
             <w:pPr>
+              <w:bidi w:val="0"/>
+              <w:jc w:val="left"/>
               <w:pStyle w:val="Compact"/>
               <w:jc w:val="left"/>
             </w:pPr>
@@ -6689,6 +6869,8 @@
           <w:tcPr/>
           <w:p>
             <w:pPr>
+              <w:bidi w:val="0"/>
+              <w:jc w:val="left"/>
               <w:pStyle w:val="Compact"/>
               <w:jc w:val="left"/>
             </w:pPr>
@@ -6704,6 +6886,8 @@
           <w:tcPr/>
           <w:p>
             <w:pPr>
+              <w:bidi w:val="0"/>
+              <w:jc w:val="left"/>
               <w:pStyle w:val="Compact"/>
               <w:jc w:val="left"/>
             </w:pPr>
@@ -6719,6 +6903,8 @@
           <w:tcPr/>
           <w:p>
             <w:pPr>
+              <w:bidi w:val="0"/>
+              <w:jc w:val="left"/>
               <w:pStyle w:val="Compact"/>
               <w:jc w:val="left"/>
             </w:pPr>
@@ -6734,6 +6920,8 @@
           <w:tcPr/>
           <w:p>
             <w:pPr>
+              <w:bidi w:val="0"/>
+              <w:jc w:val="left"/>
               <w:pStyle w:val="Compact"/>
               <w:jc w:val="left"/>
             </w:pPr>
@@ -6749,6 +6937,8 @@
           <w:tcPr/>
           <w:p>
             <w:pPr>
+              <w:bidi w:val="0"/>
+              <w:jc w:val="left"/>
               <w:pStyle w:val="Compact"/>
               <w:jc w:val="left"/>
             </w:pPr>
@@ -6766,6 +6956,8 @@
           <w:tcPr/>
           <w:p>
             <w:pPr>
+              <w:bidi w:val="0"/>
+              <w:jc w:val="left"/>
               <w:pStyle w:val="Compact"/>
               <w:jc w:val="left"/>
             </w:pPr>
@@ -6781,6 +6973,8 @@
           <w:tcPr/>
           <w:p>
             <w:pPr>
+              <w:bidi w:val="0"/>
+              <w:jc w:val="left"/>
               <w:pStyle w:val="Compact"/>
               <w:jc w:val="left"/>
             </w:pPr>
@@ -6796,6 +6990,8 @@
           <w:tcPr/>
           <w:p>
             <w:pPr>
+              <w:bidi w:val="0"/>
+              <w:jc w:val="left"/>
               <w:pStyle w:val="Compact"/>
               <w:jc w:val="left"/>
             </w:pPr>
@@ -6811,6 +7007,8 @@
           <w:tcPr/>
           <w:p>
             <w:pPr>
+              <w:bidi w:val="0"/>
+              <w:jc w:val="left"/>
               <w:pStyle w:val="Compact"/>
               <w:jc w:val="left"/>
             </w:pPr>
@@ -6826,6 +7024,8 @@
           <w:tcPr/>
           <w:p>
             <w:pPr>
+              <w:bidi w:val="0"/>
+              <w:jc w:val="left"/>
               <w:pStyle w:val="Compact"/>
               <w:jc w:val="left"/>
             </w:pPr>
@@ -6841,6 +7041,8 @@
           <w:tcPr/>
           <w:p>
             <w:pPr>
+              <w:bidi w:val="0"/>
+              <w:jc w:val="left"/>
               <w:pStyle w:val="Compact"/>
               <w:jc w:val="left"/>
             </w:pPr>
@@ -6858,6 +7060,8 @@
           <w:tcPr/>
           <w:p>
             <w:pPr>
+              <w:bidi w:val="0"/>
+              <w:jc w:val="left"/>
               <w:pStyle w:val="Compact"/>
               <w:jc w:val="left"/>
             </w:pPr>
@@ -6873,6 +7077,8 @@
           <w:tcPr/>
           <w:p>
             <w:pPr>
+              <w:bidi w:val="0"/>
+              <w:jc w:val="left"/>
               <w:pStyle w:val="Compact"/>
               <w:jc w:val="left"/>
             </w:pPr>
@@ -6888,6 +7094,8 @@
           <w:tcPr/>
           <w:p>
             <w:pPr>
+              <w:bidi w:val="0"/>
+              <w:jc w:val="left"/>
               <w:pStyle w:val="Compact"/>
               <w:jc w:val="left"/>
             </w:pPr>
@@ -6903,6 +7111,8 @@
           <w:tcPr/>
           <w:p>
             <w:pPr>
+              <w:bidi w:val="0"/>
+              <w:jc w:val="left"/>
               <w:pStyle w:val="Compact"/>
               <w:jc w:val="left"/>
             </w:pPr>
@@ -6918,6 +7128,8 @@
           <w:tcPr/>
           <w:p>
             <w:pPr>
+              <w:bidi w:val="0"/>
+              <w:jc w:val="left"/>
               <w:pStyle w:val="Compact"/>
               <w:jc w:val="left"/>
             </w:pPr>
@@ -6933,6 +7145,8 @@
           <w:tcPr/>
           <w:p>
             <w:pPr>
+              <w:bidi w:val="0"/>
+              <w:jc w:val="left"/>
               <w:pStyle w:val="Compact"/>
               <w:jc w:val="left"/>
             </w:pPr>
@@ -6950,6 +7164,8 @@
           <w:tcPr/>
           <w:p>
             <w:pPr>
+              <w:bidi w:val="0"/>
+              <w:jc w:val="left"/>
               <w:pStyle w:val="Compact"/>
               <w:jc w:val="left"/>
             </w:pPr>
@@ -6965,6 +7181,8 @@
           <w:tcPr/>
           <w:p>
             <w:pPr>
+              <w:bidi w:val="0"/>
+              <w:jc w:val="left"/>
               <w:pStyle w:val="Compact"/>
               <w:jc w:val="left"/>
             </w:pPr>
@@ -6980,6 +7198,8 @@
           <w:tcPr/>
           <w:p>
             <w:pPr>
+              <w:bidi w:val="0"/>
+              <w:jc w:val="left"/>
               <w:pStyle w:val="Compact"/>
               <w:jc w:val="left"/>
             </w:pPr>
@@ -6995,6 +7215,8 @@
           <w:tcPr/>
           <w:p>
             <w:pPr>
+              <w:bidi w:val="0"/>
+              <w:jc w:val="left"/>
               <w:pStyle w:val="Compact"/>
               <w:jc w:val="left"/>
             </w:pPr>
@@ -7010,6 +7232,8 @@
           <w:tcPr/>
           <w:p>
             <w:pPr>
+              <w:bidi w:val="0"/>
+              <w:jc w:val="left"/>
               <w:pStyle w:val="Compact"/>
               <w:jc w:val="left"/>
             </w:pPr>
@@ -7025,6 +7249,8 @@
           <w:tcPr/>
           <w:p>
             <w:pPr>
+              <w:bidi w:val="0"/>
+              <w:jc w:val="left"/>
               <w:pStyle w:val="Compact"/>
               <w:jc w:val="left"/>
             </w:pPr>
@@ -7042,6 +7268,8 @@
           <w:tcPr/>
           <w:p>
             <w:pPr>
+              <w:bidi w:val="0"/>
+              <w:jc w:val="left"/>
               <w:pStyle w:val="Compact"/>
               <w:jc w:val="left"/>
             </w:pPr>
@@ -7057,6 +7285,8 @@
           <w:tcPr/>
           <w:p>
             <w:pPr>
+              <w:bidi w:val="0"/>
+              <w:jc w:val="left"/>
               <w:pStyle w:val="Compact"/>
               <w:jc w:val="left"/>
             </w:pPr>
@@ -7072,6 +7302,8 @@
           <w:tcPr/>
           <w:p>
             <w:pPr>
+              <w:bidi w:val="0"/>
+              <w:jc w:val="left"/>
               <w:pStyle w:val="Compact"/>
               <w:jc w:val="left"/>
             </w:pPr>
@@ -7087,6 +7319,8 @@
           <w:tcPr/>
           <w:p>
             <w:pPr>
+              <w:bidi w:val="0"/>
+              <w:jc w:val="left"/>
               <w:pStyle w:val="Compact"/>
               <w:jc w:val="left"/>
             </w:pPr>
@@ -7102,6 +7336,8 @@
           <w:tcPr/>
           <w:p>
             <w:pPr>
+              <w:bidi w:val="0"/>
+              <w:jc w:val="left"/>
               <w:pStyle w:val="Compact"/>
               <w:jc w:val="left"/>
             </w:pPr>
@@ -7117,6 +7353,8 @@
           <w:tcPr/>
           <w:p>
             <w:pPr>
+              <w:bidi w:val="0"/>
+              <w:jc w:val="left"/>
               <w:pStyle w:val="Compact"/>
               <w:jc w:val="left"/>
             </w:pPr>
@@ -7134,6 +7372,8 @@
           <w:tcPr/>
           <w:p>
             <w:pPr>
+              <w:bidi w:val="0"/>
+              <w:jc w:val="left"/>
               <w:pStyle w:val="Compact"/>
               <w:jc w:val="left"/>
             </w:pPr>
@@ -7149,6 +7389,8 @@
           <w:tcPr/>
           <w:p>
             <w:pPr>
+              <w:bidi w:val="0"/>
+              <w:jc w:val="left"/>
               <w:pStyle w:val="Compact"/>
               <w:jc w:val="left"/>
             </w:pPr>
@@ -7164,6 +7406,8 @@
           <w:tcPr/>
           <w:p>
             <w:pPr>
+              <w:bidi w:val="0"/>
+              <w:jc w:val="left"/>
               <w:pStyle w:val="Compact"/>
               <w:jc w:val="left"/>
             </w:pPr>
@@ -7179,6 +7423,8 @@
           <w:tcPr/>
           <w:p>
             <w:pPr>
+              <w:bidi w:val="0"/>
+              <w:jc w:val="left"/>
               <w:pStyle w:val="Compact"/>
               <w:jc w:val="left"/>
             </w:pPr>
@@ -7194,6 +7440,8 @@
           <w:tcPr/>
           <w:p>
             <w:pPr>
+              <w:bidi w:val="0"/>
+              <w:jc w:val="left"/>
               <w:pStyle w:val="Compact"/>
               <w:jc w:val="left"/>
             </w:pPr>
@@ -7209,6 +7457,8 @@
           <w:tcPr/>
           <w:p>
             <w:pPr>
+              <w:bidi w:val="0"/>
+              <w:jc w:val="left"/>
               <w:pStyle w:val="Compact"/>
               <w:jc w:val="left"/>
             </w:pPr>
@@ -7226,6 +7476,8 @@
           <w:tcPr/>
           <w:p>
             <w:pPr>
+              <w:bidi w:val="0"/>
+              <w:jc w:val="left"/>
               <w:pStyle w:val="Compact"/>
               <w:jc w:val="left"/>
             </w:pPr>
@@ -7241,6 +7493,8 @@
           <w:tcPr/>
           <w:p>
             <w:pPr>
+              <w:bidi w:val="0"/>
+              <w:jc w:val="left"/>
               <w:pStyle w:val="Compact"/>
               <w:jc w:val="left"/>
             </w:pPr>
@@ -7256,6 +7510,8 @@
           <w:tcPr/>
           <w:p>
             <w:pPr>
+              <w:bidi w:val="0"/>
+              <w:jc w:val="left"/>
               <w:pStyle w:val="Compact"/>
               <w:jc w:val="left"/>
             </w:pPr>
@@ -7271,6 +7527,8 @@
           <w:tcPr/>
           <w:p>
             <w:pPr>
+              <w:bidi w:val="0"/>
+              <w:jc w:val="left"/>
               <w:pStyle w:val="Compact"/>
               <w:jc w:val="left"/>
             </w:pPr>
@@ -7286,6 +7544,8 @@
           <w:tcPr/>
           <w:p>
             <w:pPr>
+              <w:bidi w:val="0"/>
+              <w:jc w:val="left"/>
               <w:pStyle w:val="Compact"/>
               <w:jc w:val="left"/>
             </w:pPr>
@@ -7301,6 +7561,8 @@
           <w:tcPr/>
           <w:p>
             <w:pPr>
+              <w:bidi w:val="0"/>
+              <w:jc w:val="left"/>
               <w:pStyle w:val="Compact"/>
               <w:jc w:val="left"/>
             </w:pPr>
@@ -7318,6 +7580,8 @@
           <w:tcPr/>
           <w:p>
             <w:pPr>
+              <w:bidi w:val="0"/>
+              <w:jc w:val="left"/>
               <w:pStyle w:val="Compact"/>
               <w:jc w:val="left"/>
             </w:pPr>
@@ -7333,6 +7597,8 @@
           <w:tcPr/>
           <w:p>
             <w:pPr>
+              <w:bidi w:val="0"/>
+              <w:jc w:val="left"/>
               <w:pStyle w:val="Compact"/>
               <w:jc w:val="left"/>
             </w:pPr>
@@ -7348,6 +7614,8 @@
           <w:tcPr/>
           <w:p>
             <w:pPr>
+              <w:bidi w:val="0"/>
+              <w:jc w:val="left"/>
               <w:pStyle w:val="Compact"/>
               <w:jc w:val="left"/>
             </w:pPr>
@@ -7363,6 +7631,8 @@
           <w:tcPr/>
           <w:p>
             <w:pPr>
+              <w:bidi w:val="0"/>
+              <w:jc w:val="left"/>
               <w:pStyle w:val="Compact"/>
               <w:jc w:val="left"/>
             </w:pPr>
@@ -7378,6 +7648,8 @@
           <w:tcPr/>
           <w:p>
             <w:pPr>
+              <w:bidi w:val="0"/>
+              <w:jc w:val="left"/>
               <w:pStyle w:val="Compact"/>
               <w:jc w:val="left"/>
             </w:pPr>
@@ -7393,6 +7665,8 @@
           <w:tcPr/>
           <w:p>
             <w:pPr>
+              <w:bidi w:val="0"/>
+              <w:jc w:val="left"/>
               <w:pStyle w:val="Compact"/>
               <w:jc w:val="left"/>
             </w:pPr>
@@ -7410,6 +7684,8 @@
           <w:tcPr/>
           <w:p>
             <w:pPr>
+              <w:bidi w:val="0"/>
+              <w:jc w:val="left"/>
               <w:pStyle w:val="Compact"/>
               <w:jc w:val="left"/>
             </w:pPr>
@@ -7425,6 +7701,8 @@
           <w:tcPr/>
           <w:p>
             <w:pPr>
+              <w:bidi w:val="0"/>
+              <w:jc w:val="left"/>
               <w:pStyle w:val="Compact"/>
               <w:jc w:val="left"/>
             </w:pPr>
@@ -7440,6 +7718,8 @@
           <w:tcPr/>
           <w:p>
             <w:pPr>
+              <w:bidi w:val="0"/>
+              <w:jc w:val="left"/>
               <w:pStyle w:val="Compact"/>
               <w:jc w:val="left"/>
             </w:pPr>
@@ -7455,6 +7735,8 @@
           <w:tcPr/>
           <w:p>
             <w:pPr>
+              <w:bidi w:val="0"/>
+              <w:jc w:val="left"/>
               <w:pStyle w:val="Compact"/>
               <w:jc w:val="left"/>
             </w:pPr>
@@ -7470,6 +7752,8 @@
           <w:tcPr/>
           <w:p>
             <w:pPr>
+              <w:bidi w:val="0"/>
+              <w:jc w:val="left"/>
               <w:pStyle w:val="Compact"/>
               <w:jc w:val="left"/>
             </w:pPr>
@@ -7485,6 +7769,8 @@
           <w:tcPr/>
           <w:p>
             <w:pPr>
+              <w:bidi w:val="0"/>
+              <w:jc w:val="left"/>
               <w:pStyle w:val="Compact"/>
               <w:jc w:val="left"/>
             </w:pPr>
@@ -7502,6 +7788,8 @@
           <w:tcPr/>
           <w:p>
             <w:pPr>
+              <w:bidi w:val="0"/>
+              <w:jc w:val="left"/>
               <w:pStyle w:val="Compact"/>
               <w:jc w:val="left"/>
             </w:pPr>
@@ -7517,6 +7805,8 @@
           <w:tcPr/>
           <w:p>
             <w:pPr>
+              <w:bidi w:val="0"/>
+              <w:jc w:val="left"/>
               <w:pStyle w:val="Compact"/>
               <w:jc w:val="left"/>
             </w:pPr>
@@ -7532,6 +7822,8 @@
           <w:tcPr/>
           <w:p>
             <w:pPr>
+              <w:bidi w:val="0"/>
+              <w:jc w:val="left"/>
               <w:pStyle w:val="Compact"/>
               <w:jc w:val="left"/>
             </w:pPr>
@@ -7547,6 +7839,8 @@
           <w:tcPr/>
           <w:p>
             <w:pPr>
+              <w:bidi w:val="0"/>
+              <w:jc w:val="left"/>
               <w:pStyle w:val="Compact"/>
               <w:jc w:val="left"/>
             </w:pPr>
@@ -7562,6 +7856,8 @@
           <w:tcPr/>
           <w:p>
             <w:pPr>
+              <w:bidi w:val="0"/>
+              <w:jc w:val="left"/>
               <w:pStyle w:val="Compact"/>
               <w:jc w:val="left"/>
             </w:pPr>
@@ -7577,6 +7873,8 @@
           <w:tcPr/>
           <w:p>
             <w:pPr>
+              <w:bidi w:val="0"/>
+              <w:jc w:val="left"/>
               <w:pStyle w:val="Compact"/>
               <w:jc w:val="left"/>
             </w:pPr>
@@ -7594,6 +7892,8 @@
           <w:tcPr/>
           <w:p>
             <w:pPr>
+              <w:bidi w:val="0"/>
+              <w:jc w:val="left"/>
               <w:pStyle w:val="Compact"/>
               <w:jc w:val="left"/>
             </w:pPr>
@@ -7609,6 +7909,8 @@
           <w:tcPr/>
           <w:p>
             <w:pPr>
+              <w:bidi w:val="0"/>
+              <w:jc w:val="left"/>
               <w:pStyle w:val="Compact"/>
               <w:jc w:val="left"/>
             </w:pPr>
@@ -7624,6 +7926,8 @@
           <w:tcPr/>
           <w:p>
             <w:pPr>
+              <w:bidi w:val="0"/>
+              <w:jc w:val="left"/>
               <w:pStyle w:val="Compact"/>
               <w:jc w:val="left"/>
             </w:pPr>
@@ -7639,6 +7943,8 @@
           <w:tcPr/>
           <w:p>
             <w:pPr>
+              <w:bidi w:val="0"/>
+              <w:jc w:val="left"/>
               <w:pStyle w:val="Compact"/>
               <w:jc w:val="left"/>
             </w:pPr>
@@ -7654,6 +7960,8 @@
           <w:tcPr/>
           <w:p>
             <w:pPr>
+              <w:bidi w:val="0"/>
+              <w:jc w:val="left"/>
               <w:pStyle w:val="Compact"/>
               <w:jc w:val="left"/>
             </w:pPr>
@@ -7669,6 +7977,8 @@
           <w:tcPr/>
           <w:p>
             <w:pPr>
+              <w:bidi w:val="0"/>
+              <w:jc w:val="left"/>
               <w:pStyle w:val="Compact"/>
               <w:jc w:val="left"/>
             </w:pPr>
@@ -7686,6 +7996,8 @@
           <w:tcPr/>
           <w:p>
             <w:pPr>
+              <w:bidi w:val="0"/>
+              <w:jc w:val="left"/>
               <w:pStyle w:val="Compact"/>
               <w:jc w:val="left"/>
             </w:pPr>
@@ -7701,6 +8013,8 @@
           <w:tcPr/>
           <w:p>
             <w:pPr>
+              <w:bidi w:val="0"/>
+              <w:jc w:val="left"/>
               <w:pStyle w:val="Compact"/>
               <w:jc w:val="left"/>
             </w:pPr>
@@ -7716,6 +8030,8 @@
           <w:tcPr/>
           <w:p>
             <w:pPr>
+              <w:bidi w:val="0"/>
+              <w:jc w:val="left"/>
               <w:pStyle w:val="Compact"/>
               <w:jc w:val="left"/>
             </w:pPr>
@@ -7731,6 +8047,8 @@
           <w:tcPr/>
           <w:p>
             <w:pPr>
+              <w:bidi w:val="0"/>
+              <w:jc w:val="left"/>
               <w:pStyle w:val="Compact"/>
               <w:jc w:val="left"/>
             </w:pPr>
@@ -7746,6 +8064,8 @@
           <w:tcPr/>
           <w:p>
             <w:pPr>
+              <w:bidi w:val="0"/>
+              <w:jc w:val="left"/>
               <w:pStyle w:val="Compact"/>
               <w:jc w:val="left"/>
             </w:pPr>
@@ -7761,6 +8081,8 @@
           <w:tcPr/>
           <w:p>
             <w:pPr>
+              <w:bidi w:val="0"/>
+              <w:jc w:val="left"/>
               <w:pStyle w:val="Compact"/>
               <w:jc w:val="left"/>
             </w:pPr>
@@ -7778,6 +8100,8 @@
           <w:tcPr/>
           <w:p>
             <w:pPr>
+              <w:bidi w:val="0"/>
+              <w:jc w:val="left"/>
               <w:pStyle w:val="Compact"/>
               <w:jc w:val="left"/>
             </w:pPr>
@@ -7793,6 +8117,8 @@
           <w:tcPr/>
           <w:p>
             <w:pPr>
+              <w:bidi w:val="0"/>
+              <w:jc w:val="left"/>
               <w:pStyle w:val="Compact"/>
               <w:jc w:val="left"/>
             </w:pPr>
@@ -7808,6 +8134,8 @@
           <w:tcPr/>
           <w:p>
             <w:pPr>
+              <w:bidi w:val="0"/>
+              <w:jc w:val="left"/>
               <w:pStyle w:val="Compact"/>
               <w:jc w:val="left"/>
             </w:pPr>
@@ -7823,6 +8151,8 @@
           <w:tcPr/>
           <w:p>
             <w:pPr>
+              <w:bidi w:val="0"/>
+              <w:jc w:val="left"/>
               <w:pStyle w:val="Compact"/>
               <w:jc w:val="left"/>
             </w:pPr>
@@ -7838,6 +8168,8 @@
           <w:tcPr/>
           <w:p>
             <w:pPr>
+              <w:bidi w:val="0"/>
+              <w:jc w:val="left"/>
               <w:pStyle w:val="Compact"/>
               <w:jc w:val="left"/>
             </w:pPr>
@@ -7853,6 +8185,8 @@
           <w:tcPr/>
           <w:p>
             <w:pPr>
+              <w:bidi w:val="0"/>
+              <w:jc w:val="left"/>
               <w:pStyle w:val="Compact"/>
               <w:jc w:val="left"/>
             </w:pPr>
@@ -7870,6 +8204,8 @@
           <w:tcPr/>
           <w:p>
             <w:pPr>
+              <w:bidi w:val="0"/>
+              <w:jc w:val="left"/>
               <w:pStyle w:val="Compact"/>
               <w:jc w:val="left"/>
             </w:pPr>
@@ -7885,6 +8221,8 @@
           <w:tcPr/>
           <w:p>
             <w:pPr>
+              <w:bidi w:val="0"/>
+              <w:jc w:val="left"/>
               <w:pStyle w:val="Compact"/>
               <w:jc w:val="left"/>
             </w:pPr>
@@ -7900,6 +8238,8 @@
           <w:tcPr/>
           <w:p>
             <w:pPr>
+              <w:bidi w:val="0"/>
+              <w:jc w:val="left"/>
               <w:pStyle w:val="Compact"/>
               <w:jc w:val="left"/>
             </w:pPr>
@@ -7915,6 +8255,8 @@
           <w:tcPr/>
           <w:p>
             <w:pPr>
+              <w:bidi w:val="0"/>
+              <w:jc w:val="left"/>
               <w:pStyle w:val="Compact"/>
               <w:jc w:val="left"/>
             </w:pPr>
@@ -7930,6 +8272,8 @@
           <w:tcPr/>
           <w:p>
             <w:pPr>
+              <w:bidi w:val="0"/>
+              <w:jc w:val="left"/>
               <w:pStyle w:val="Compact"/>
               <w:jc w:val="left"/>
             </w:pPr>
@@ -7945,6 +8289,8 @@
           <w:tcPr/>
           <w:p>
             <w:pPr>
+              <w:bidi w:val="0"/>
+              <w:jc w:val="left"/>
               <w:pStyle w:val="Compact"/>
               <w:jc w:val="left"/>
             </w:pPr>
@@ -7962,6 +8308,8 @@
           <w:tcPr/>
           <w:p>
             <w:pPr>
+              <w:bidi w:val="0"/>
+              <w:jc w:val="left"/>
               <w:pStyle w:val="Compact"/>
               <w:jc w:val="left"/>
             </w:pPr>
@@ -7977,6 +8325,8 @@
           <w:tcPr/>
           <w:p>
             <w:pPr>
+              <w:bidi w:val="0"/>
+              <w:jc w:val="left"/>
               <w:pStyle w:val="Compact"/>
               <w:jc w:val="left"/>
             </w:pPr>
@@ -7992,6 +8342,8 @@
           <w:tcPr/>
           <w:p>
             <w:pPr>
+              <w:bidi w:val="0"/>
+              <w:jc w:val="left"/>
               <w:pStyle w:val="Compact"/>
               <w:jc w:val="left"/>
             </w:pPr>
@@ -8007,6 +8359,8 @@
           <w:tcPr/>
           <w:p>
             <w:pPr>
+              <w:bidi w:val="0"/>
+              <w:jc w:val="left"/>
               <w:pStyle w:val="Compact"/>
               <w:jc w:val="left"/>
             </w:pPr>
@@ -8022,6 +8376,8 @@
           <w:tcPr/>
           <w:p>
             <w:pPr>
+              <w:bidi w:val="0"/>
+              <w:jc w:val="left"/>
               <w:pStyle w:val="Compact"/>
               <w:jc w:val="left"/>
             </w:pPr>
@@ -8037,6 +8393,8 @@
           <w:tcPr/>
           <w:p>
             <w:pPr>
+              <w:bidi w:val="0"/>
+              <w:jc w:val="left"/>
               <w:pStyle w:val="Compact"/>
               <w:jc w:val="left"/>
             </w:pPr>
@@ -8054,6 +8412,8 @@
     <w:bookmarkStart w:id="37" w:name="hardening-production-grade-edge-handling"/>
     <w:p>
       <w:pPr>
+        <w:bidi w:val="0"/>
+        <w:jc w:val="left"/>
         <w:pStyle w:val="Heading2"/>
       </w:pPr>
       <w:r>
@@ -8065,6 +8425,8 @@
     </w:p>
     <w:p>
       <w:pPr>
+        <w:bidi w:val="0"/>
+        <w:jc w:val="left"/>
         <w:pStyle w:val="FirstParagraph"/>
       </w:pPr>
       <w:r>
@@ -8076,6 +8438,8 @@
     </w:p>
     <w:p>
       <w:pPr>
+        <w:bidi w:val="0"/>
+        <w:jc w:val="left"/>
         <w:numPr>
           <w:ilvl w:val="0"/>
           <w:numId w:val="1021"/>
@@ -8293,6 +8657,8 @@
     </w:p>
     <w:p>
       <w:pPr>
+        <w:bidi w:val="0"/>
+        <w:jc w:val="left"/>
         <w:numPr>
           <w:ilvl w:val="0"/>
           <w:numId w:val="1021"/>
@@ -8477,6 +8843,8 @@
     </w:p>
     <w:p>
       <w:pPr>
+        <w:bidi w:val="0"/>
+        <w:jc w:val="left"/>
         <w:numPr>
           <w:ilvl w:val="0"/>
           <w:numId w:val="1021"/>
@@ -8542,6 +8910,8 @@
     </w:p>
     <w:p>
       <w:pPr>
+        <w:bidi w:val="0"/>
+        <w:jc w:val="left"/>
         <w:numPr>
           <w:ilvl w:val="0"/>
           <w:numId w:val="1021"/>
@@ -8678,6 +9048,8 @@
     </w:p>
     <w:p>
       <w:pPr>
+        <w:bidi w:val="0"/>
+        <w:jc w:val="left"/>
         <w:numPr>
           <w:ilvl w:val="0"/>
           <w:numId w:val="1021"/>
@@ -8811,6 +9183,8 @@
     </w:p>
     <w:p>
       <w:pPr>
+        <w:bidi w:val="0"/>
+        <w:jc w:val="left"/>
         <w:numPr>
           <w:ilvl w:val="0"/>
           <w:numId w:val="1021"/>
@@ -8876,6 +9250,8 @@
     <w:bookmarkStart w:id="43" w:name="X364d4da7af21d30ee909a6703f0d6d54b1f7512"/>
     <w:p>
       <w:pPr>
+        <w:bidi w:val="0"/>
+        <w:jc w:val="left"/>
         <w:pStyle w:val="Heading2"/>
       </w:pPr>
       <w:r>
@@ -8887,6 +9263,8 @@
     </w:p>
     <w:p>
       <w:pPr>
+        <w:bidi w:val="0"/>
+        <w:jc w:val="left"/>
         <w:pStyle w:val="FirstParagraph"/>
       </w:pPr>
       <w:r>
@@ -9029,6 +9407,8 @@
     <w:bookmarkStart w:id="38" w:name="account-executives"/>
     <w:p>
       <w:pPr>
+        <w:bidi w:val="0"/>
+        <w:jc w:val="left"/>
         <w:pStyle w:val="Heading3"/>
       </w:pPr>
       <w:r>
@@ -9040,6 +9420,8 @@
     </w:p>
     <w:p>
       <w:pPr>
+        <w:bidi w:val="0"/>
+        <w:jc w:val="left"/>
         <w:numPr>
           <w:ilvl w:val="0"/>
           <w:numId w:val="1022"/>
@@ -9069,6 +9451,8 @@
     </w:p>
     <w:p>
       <w:pPr>
+        <w:bidi w:val="0"/>
+        <w:jc w:val="left"/>
         <w:numPr>
           <w:ilvl w:val="0"/>
           <w:numId w:val="1022"/>
@@ -9148,6 +9532,8 @@
     </w:p>
     <w:p>
       <w:pPr>
+        <w:bidi w:val="0"/>
+        <w:jc w:val="left"/>
         <w:numPr>
           <w:ilvl w:val="0"/>
           <w:numId w:val="1022"/>
@@ -9196,6 +9582,8 @@
     </w:p>
     <w:p>
       <w:pPr>
+        <w:bidi w:val="0"/>
+        <w:jc w:val="left"/>
         <w:numPr>
           <w:ilvl w:val="0"/>
           <w:numId w:val="1022"/>
@@ -9265,6 +9653,8 @@
     <w:bookmarkStart w:id="39" w:name="solution-engineering"/>
     <w:p>
       <w:pPr>
+        <w:bidi w:val="0"/>
+        <w:jc w:val="left"/>
         <w:pStyle w:val="Heading3"/>
       </w:pPr>
       <w:r>
@@ -9276,6 +9666,8 @@
     </w:p>
     <w:p>
       <w:pPr>
+        <w:bidi w:val="0"/>
+        <w:jc w:val="left"/>
         <w:numPr>
           <w:ilvl w:val="0"/>
           <w:numId w:val="1023"/>
@@ -9305,6 +9697,8 @@
     </w:p>
     <w:p>
       <w:pPr>
+        <w:bidi w:val="0"/>
+        <w:jc w:val="left"/>
         <w:numPr>
           <w:ilvl w:val="0"/>
           <w:numId w:val="1023"/>
@@ -9370,6 +9764,8 @@
     </w:p>
     <w:p>
       <w:pPr>
+        <w:bidi w:val="0"/>
+        <w:jc w:val="left"/>
         <w:numPr>
           <w:ilvl w:val="0"/>
           <w:numId w:val="1023"/>
@@ -9436,6 +9832,8 @@
     </w:p>
     <w:p>
       <w:pPr>
+        <w:bidi w:val="0"/>
+        <w:jc w:val="left"/>
         <w:numPr>
           <w:ilvl w:val="0"/>
           <w:numId w:val="1023"/>
@@ -9479,6 +9877,8 @@
     <w:bookmarkStart w:id="40" w:name="product"/>
     <w:p>
       <w:pPr>
+        <w:bidi w:val="0"/>
+        <w:jc w:val="left"/>
         <w:pStyle w:val="Heading3"/>
       </w:pPr>
       <w:r>
@@ -9490,6 +9890,8 @@
     </w:p>
     <w:p>
       <w:pPr>
+        <w:bidi w:val="0"/>
+        <w:jc w:val="left"/>
         <w:numPr>
           <w:ilvl w:val="0"/>
           <w:numId w:val="1024"/>
@@ -9519,6 +9921,8 @@
     </w:p>
     <w:p>
       <w:pPr>
+        <w:bidi w:val="0"/>
+        <w:jc w:val="left"/>
         <w:numPr>
           <w:ilvl w:val="0"/>
           <w:numId w:val="1024"/>
@@ -9622,6 +10026,8 @@
     </w:p>
     <w:p>
       <w:pPr>
+        <w:bidi w:val="0"/>
+        <w:jc w:val="left"/>
         <w:numPr>
           <w:ilvl w:val="0"/>
           <w:numId w:val="1024"/>
@@ -9702,6 +10108,8 @@
     </w:p>
     <w:p>
       <w:pPr>
+        <w:bidi w:val="0"/>
+        <w:jc w:val="left"/>
         <w:numPr>
           <w:ilvl w:val="0"/>
           <w:numId w:val="1024"/>
@@ -9745,6 +10153,8 @@
     <w:bookmarkStart w:id="41" w:name="sales-leadership"/>
     <w:p>
       <w:pPr>
+        <w:bidi w:val="0"/>
+        <w:jc w:val="left"/>
         <w:pStyle w:val="Heading3"/>
       </w:pPr>
       <w:r>
@@ -9756,6 +10166,8 @@
     </w:p>
     <w:p>
       <w:pPr>
+        <w:bidi w:val="0"/>
+        <w:jc w:val="left"/>
         <w:numPr>
           <w:ilvl w:val="0"/>
           <w:numId w:val="1025"/>
@@ -9785,6 +10197,8 @@
     </w:p>
     <w:p>
       <w:pPr>
+        <w:bidi w:val="0"/>
+        <w:jc w:val="left"/>
         <w:numPr>
           <w:ilvl w:val="0"/>
           <w:numId w:val="1025"/>
@@ -9864,6 +10278,8 @@
     </w:p>
     <w:p>
       <w:pPr>
+        <w:bidi w:val="0"/>
+        <w:jc w:val="left"/>
         <w:numPr>
           <w:ilvl w:val="0"/>
           <w:numId w:val="1025"/>
@@ -9905,6 +10321,8 @@
     </w:p>
     <w:p>
       <w:pPr>
+        <w:bidi w:val="0"/>
+        <w:jc w:val="left"/>
         <w:numPr>
           <w:ilvl w:val="0"/>
           <w:numId w:val="1025"/>
@@ -9984,6 +10402,8 @@
     <w:bookmarkStart w:id="42" w:name="founders"/>
     <w:p>
       <w:pPr>
+        <w:bidi w:val="0"/>
+        <w:jc w:val="left"/>
         <w:pStyle w:val="Heading3"/>
       </w:pPr>
       <w:r>
@@ -9995,6 +10415,8 @@
     </w:p>
     <w:p>
       <w:pPr>
+        <w:bidi w:val="0"/>
+        <w:jc w:val="left"/>
         <w:numPr>
           <w:ilvl w:val="0"/>
           <w:numId w:val="1026"/>
@@ -10024,6 +10446,8 @@
     </w:p>
     <w:p>
       <w:pPr>
+        <w:bidi w:val="0"/>
+        <w:jc w:val="left"/>
         <w:numPr>
           <w:ilvl w:val="0"/>
           <w:numId w:val="1026"/>
@@ -10077,6 +10501,8 @@
     </w:p>
     <w:p>
       <w:pPr>
+        <w:bidi w:val="0"/>
+        <w:jc w:val="left"/>
         <w:numPr>
           <w:ilvl w:val="0"/>
           <w:numId w:val="1026"/>
@@ -10130,6 +10556,8 @@
     </w:p>
     <w:p>
       <w:pPr>
+        <w:bidi w:val="0"/>
+        <w:jc w:val="left"/>
         <w:numPr>
           <w:ilvl w:val="0"/>
           <w:numId w:val="1026"/>
@@ -10184,6 +10612,8 @@
     <w:bookmarkStart w:id="49" w:name="part-3-storage-retrospective-analysis"/>
     <w:p>
       <w:pPr>
+        <w:bidi w:val="0"/>
+        <w:jc w:val="left"/>
         <w:pStyle w:val="Heading2"/>
       </w:pPr>
       <w:r>
@@ -10196,6 +10626,8 @@
     <w:bookmarkStart w:id="44" w:name="where-and-why"/>
     <w:p>
       <w:pPr>
+        <w:bidi w:val="0"/>
+        <w:jc w:val="left"/>
         <w:pStyle w:val="Heading3"/>
       </w:pPr>
       <w:r>
@@ -10207,6 +10639,8 @@
     </w:p>
     <w:p>
       <w:pPr>
+        <w:bidi w:val="0"/>
+        <w:jc w:val="left"/>
         <w:pStyle w:val="FirstParagraph"/>
       </w:pPr>
       <w:r>
@@ -10508,6 +10942,8 @@
     <w:bookmarkStart w:id="45" w:name="schema-star-ish"/>
     <w:p>
       <w:pPr>
+        <w:bidi w:val="0"/>
+        <w:jc w:val="left"/>
         <w:pStyle w:val="Heading3"/>
       </w:pPr>
       <w:r>
@@ -10519,6 +10955,8 @@
     </w:p>
     <w:p>
       <w:pPr>
+        <w:bidi w:val="0"/>
+        <w:jc w:val="left"/>
         <w:pStyle w:val="FirstParagraph"/>
       </w:pPr>
       <w:r>
@@ -10614,6 +11052,8 @@
     </w:p>
     <w:p>
       <w:pPr>
+        <w:bidi w:val="0"/>
+        <w:jc w:val="left"/>
         <w:pStyle w:val="BodyText"/>
       </w:pPr>
       <w:r>
@@ -11813,6 +12253,8 @@
     </w:p>
     <w:p>
       <w:pPr>
+        <w:bidi w:val="0"/>
+        <w:jc w:val="left"/>
         <w:pStyle w:val="BodyText"/>
       </w:pPr>
       <w:r>
@@ -11977,6 +12419,8 @@
     <w:bookmarkStart w:id="46" w:name="questions-it-must-answer-concrete"/>
     <w:p>
       <w:pPr>
+        <w:bidi w:val="0"/>
+        <w:jc w:val="left"/>
         <w:pStyle w:val="Heading3"/>
       </w:pPr>
       <w:r>
@@ -11988,6 +12432,8 @@
     </w:p>
     <w:p>
       <w:pPr>
+        <w:bidi w:val="0"/>
+        <w:jc w:val="left"/>
         <w:numPr>
           <w:ilvl w:val="0"/>
           <w:numId w:val="1027"/>
@@ -12096,6 +12542,8 @@
     </w:p>
     <w:p>
       <w:pPr>
+        <w:bidi w:val="0"/>
+        <w:jc w:val="left"/>
         <w:numPr>
           <w:ilvl w:val="0"/>
           <w:numId w:val="1027"/>
@@ -12160,6 +12608,8 @@
     </w:p>
     <w:p>
       <w:pPr>
+        <w:bidi w:val="0"/>
+        <w:jc w:val="left"/>
         <w:numPr>
           <w:ilvl w:val="0"/>
           <w:numId w:val="1027"/>
@@ -12218,6 +12668,8 @@
     </w:p>
     <w:p>
       <w:pPr>
+        <w:bidi w:val="0"/>
+        <w:jc w:val="left"/>
         <w:numPr>
           <w:ilvl w:val="0"/>
           <w:numId w:val="1027"/>
@@ -12314,6 +12766,8 @@
     </w:p>
     <w:p>
       <w:pPr>
+        <w:bidi w:val="0"/>
+        <w:jc w:val="left"/>
         <w:numPr>
           <w:ilvl w:val="0"/>
           <w:numId w:val="1027"/>
@@ -12399,6 +12853,8 @@
     <w:bookmarkStart w:id="47" w:name="write-path-which-nodes-write-what"/>
     <w:p>
       <w:pPr>
+        <w:bidi w:val="0"/>
+        <w:jc w:val="left"/>
         <w:pStyle w:val="Heading3"/>
       </w:pPr>
       <w:r>
@@ -12410,6 +12866,8 @@
     </w:p>
     <w:p>
       <w:pPr>
+        <w:bidi w:val="0"/>
+        <w:jc w:val="left"/>
         <w:numPr>
           <w:ilvl w:val="0"/>
           <w:numId w:val="1028"/>
@@ -12540,6 +12998,8 @@
     </w:p>
     <w:p>
       <w:pPr>
+        <w:bidi w:val="0"/>
+        <w:jc w:val="left"/>
         <w:numPr>
           <w:ilvl w:val="0"/>
           <w:numId w:val="1028"/>
@@ -12594,6 +13054,8 @@
     </w:p>
     <w:p>
       <w:pPr>
+        <w:bidi w:val="0"/>
+        <w:jc w:val="left"/>
         <w:numPr>
           <w:ilvl w:val="0"/>
           <w:numId w:val="1028"/>
@@ -12694,6 +13156,8 @@
     </w:p>
     <w:p>
       <w:pPr>
+        <w:bidi w:val="0"/>
+        <w:jc w:val="left"/>
         <w:numPr>
           <w:ilvl w:val="0"/>
           <w:numId w:val="1028"/>
@@ -12748,6 +13212,8 @@
     </w:p>
     <w:p>
       <w:pPr>
+        <w:bidi w:val="0"/>
+        <w:jc w:val="left"/>
         <w:numPr>
           <w:ilvl w:val="0"/>
           <w:numId w:val="1028"/>
@@ -12821,6 +13287,8 @@
     <w:bookmarkStart w:id="48" w:name="X04ad6d5eaa65ca2a7aef7a0e7653f4cc647eb71"/>
     <w:p>
       <w:pPr>
+        <w:bidi w:val="0"/>
+        <w:jc w:val="left"/>
         <w:pStyle w:val="Heading3"/>
       </w:pPr>
       <w:r>
@@ -12832,6 +13300,8 @@
     </w:p>
     <w:p>
       <w:pPr>
+        <w:bidi w:val="0"/>
+        <w:jc w:val="left"/>
         <w:pStyle w:val="FirstParagraph"/>
       </w:pPr>
       <w:r>
@@ -12855,6 +13325,8 @@
     </w:p>
     <w:p>
       <w:pPr>
+        <w:bidi w:val="0"/>
+        <w:jc w:val="left"/>
         <w:numPr>
           <w:ilvl w:val="0"/>
           <w:numId w:val="1029"/>
@@ -12970,6 +13442,8 @@
     </w:p>
     <w:p>
       <w:pPr>
+        <w:bidi w:val="0"/>
+        <w:jc w:val="left"/>
         <w:numPr>
           <w:ilvl w:val="0"/>
           <w:numId w:val="1029"/>
@@ -13048,6 +13522,8 @@
     </w:p>
     <w:p>
       <w:pPr>
+        <w:bidi w:val="0"/>
+        <w:jc w:val="left"/>
         <w:numPr>
           <w:ilvl w:val="0"/>
           <w:numId w:val="1029"/>
@@ -13089,6 +13565,8 @@
     </w:p>
     <w:p>
       <w:pPr>
+        <w:bidi w:val="0"/>
+        <w:jc w:val="left"/>
         <w:numPr>
           <w:ilvl w:val="0"/>
           <w:numId w:val="1029"/>
@@ -13167,6 +13645,8 @@
     </w:p>
     <w:p>
       <w:pPr>
+        <w:bidi w:val="0"/>
+        <w:jc w:val="left"/>
         <w:numPr>
           <w:ilvl w:val="0"/>
           <w:numId w:val="1029"/>
@@ -13221,6 +13701,8 @@
     </w:p>
     <w:p>
       <w:pPr>
+        <w:bidi w:val="0"/>
+        <w:jc w:val="left"/>
         <w:pStyle w:val="FirstParagraph"/>
       </w:pPr>
       <w:r>
@@ -14398,6 +14880,7 @@
     <w:pPrDefault>
       <w:pPr>
         <w:spacing w:line="276" w:lineRule="auto"/>
+        <w:bidi w:val="0"/>
       </w:pPr>
     </w:pPrDefault>
   </w:docDefaults>

</xml_diff>